<commit_message>
task 4 done, still need to do report
</commit_message>
<xml_diff>
--- a/COMP1000 C1 W2 Report Template.docx
+++ b/COMP1000 C1 W2 Report Template.docx
@@ -12,7 +12,15 @@
     </w:p>
     <w:p>
       <w:r>
-        <w:t>The following document has been started for you. The intention is to list tests that need to be performed in order to evidence which requirements have been met. It is important to be honest and only claim something works if you can evidence it. Note that the assessor will be running a whole batch of tests on your code.</w:t>
+        <w:t xml:space="preserve">The following document has been started for you. The intention is to list tests that need to be performed </w:t>
+      </w:r>
+      <w:proofErr w:type="gramStart"/>
+      <w:r>
+        <w:t>in order to</w:t>
+      </w:r>
+      <w:proofErr w:type="gramEnd"/>
+      <w:r>
+        <w:t xml:space="preserve"> evidence which requirements have been met. It is important to be honest and only claim something works if you can evidence it. Note that the assessor will be running a whole batch of tests on your code.</w:t>
       </w:r>
     </w:p>
     <w:p>
@@ -25,11 +33,92 @@
         <w:t>Tasks B-D have been started, but you will need to add more tests. You should include test cases where the user enters both valid and invalid parameters.</w:t>
       </w:r>
     </w:p>
+    <w:p/>
+    <w:p>
+      <w:pPr>
+        <w:pStyle w:val="Heading2"/>
+      </w:pPr>
+      <w:r>
+        <w:t>Revision History</w:t>
+      </w:r>
+    </w:p>
+    <w:tbl>
+      <w:tblPr>
+        <w:tblStyle w:val="TableGrid"/>
+        <w:tblW w:w="0" w:type="auto"/>
+        <w:tblLook w:val="04A0" w:firstRow="1" w:lastRow="0" w:firstColumn="1" w:lastColumn="0" w:noHBand="0" w:noVBand="1"/>
+      </w:tblPr>
+      <w:tblGrid>
+        <w:gridCol w:w="607"/>
+        <w:gridCol w:w="6974"/>
+      </w:tblGrid>
+      <w:tr>
+        <w:tc>
+          <w:tcPr>
+            <w:tcW w:w="605" w:type="dxa"/>
+          </w:tcPr>
+          <w:p>
+            <w:r>
+              <w:t>1.0</w:t>
+            </w:r>
+          </w:p>
+        </w:tc>
+        <w:tc>
+          <w:tcPr>
+            <w:tcW w:w="6974" w:type="dxa"/>
+          </w:tcPr>
+          <w:p>
+            <w:r>
+              <w:t>Released to students</w:t>
+            </w:r>
+          </w:p>
+        </w:tc>
+      </w:tr>
+      <w:tr>
+        <w:tc>
+          <w:tcPr>
+            <w:tcW w:w="605" w:type="dxa"/>
+          </w:tcPr>
+          <w:p>
+            <w:r>
+              <w:t>1.01</w:t>
+            </w:r>
+          </w:p>
+        </w:tc>
+        <w:tc>
+          <w:tcPr>
+            <w:tcW w:w="6974" w:type="dxa"/>
+          </w:tcPr>
+          <w:p>
+            <w:r>
+              <w:t>Error corrected in first test for tasks B and C (highlighted in green)</w:t>
+            </w:r>
+          </w:p>
+        </w:tc>
+      </w:tr>
+    </w:tbl>
+    <w:p>
+      <w:pPr>
+        <w:pStyle w:val="Heading2"/>
+        <w:numPr>
+          <w:ilvl w:val="0"/>
+          <w:numId w:val="1"/>
+        </w:numPr>
+        <w:rPr>
+          <w:sz w:val="32"/>
+          <w:szCs w:val="32"/>
+        </w:rPr>
+      </w:pPr>
+      <w:r>
+        <w:br w:type="page"/>
+      </w:r>
+    </w:p>
     <w:p>
       <w:pPr>
         <w:pStyle w:val="Heading1"/>
       </w:pPr>
       <w:r>
+        <w:lastRenderedPageBreak/>
         <w:t xml:space="preserve">Task </w:t>
       </w:r>
       <w:r>
@@ -130,8 +219,17 @@
                 <w:b w:val="0"/>
                 <w:bCs w:val="0"/>
               </w:rPr>
-              <w:t xml:space="preserve"> if present</w:t>
-            </w:r>
+              <w:t xml:space="preserve"> if </w:t>
+            </w:r>
+            <w:proofErr w:type="gramStart"/>
+            <w:r>
+              <w:rPr>
+                <w:b w:val="0"/>
+                <w:bCs w:val="0"/>
+              </w:rPr>
+              <w:t>present</w:t>
+            </w:r>
+            <w:proofErr w:type="gramEnd"/>
           </w:p>
           <w:p>
             <w:r>
@@ -176,8 +274,36 @@
                 <w:b w:val="0"/>
                 <w:bCs w:val="0"/>
               </w:rPr>
-              <w:t>-db computing.txt -showAll</w:t>
-            </w:r>
+              <w:t>-</w:t>
+            </w:r>
+            <w:proofErr w:type="spellStart"/>
+            <w:r>
+              <w:rPr>
+                <w:rFonts w:ascii="Courier New" w:hAnsi="Courier New" w:cs="Courier New"/>
+                <w:b w:val="0"/>
+                <w:bCs w:val="0"/>
+              </w:rPr>
+              <w:t>db</w:t>
+            </w:r>
+            <w:proofErr w:type="spellEnd"/>
+            <w:r>
+              <w:rPr>
+                <w:rFonts w:ascii="Courier New" w:hAnsi="Courier New" w:cs="Courier New"/>
+                <w:b w:val="0"/>
+                <w:bCs w:val="0"/>
+              </w:rPr>
+              <w:t xml:space="preserve"> computing.txt -</w:t>
+            </w:r>
+            <w:proofErr w:type="spellStart"/>
+            <w:r>
+              <w:rPr>
+                <w:rFonts w:ascii="Courier New" w:hAnsi="Courier New" w:cs="Courier New"/>
+                <w:b w:val="0"/>
+                <w:bCs w:val="0"/>
+              </w:rPr>
+              <w:t>showAll</w:t>
+            </w:r>
+            <w:proofErr w:type="spellEnd"/>
           </w:p>
         </w:tc>
         <w:tc>
@@ -254,8 +380,13 @@
               <w:cnfStyle w:val="000000000000" w:firstRow="0" w:lastRow="0" w:firstColumn="0" w:lastColumn="0" w:oddVBand="0" w:evenVBand="0" w:oddHBand="0" w:evenHBand="0" w:firstRowFirstColumn="0" w:firstRowLastColumn="0" w:lastRowFirstColumn="0" w:lastRowLastColumn="0"/>
             </w:pPr>
             <w:r>
-              <w:t>Generates a test database computing.txt</w:t>
-            </w:r>
+              <w:t xml:space="preserve">Generates a test database </w:t>
+            </w:r>
+            <w:proofErr w:type="gramStart"/>
+            <w:r>
+              <w:t>computing.txt</w:t>
+            </w:r>
+            <w:proofErr w:type="gramEnd"/>
           </w:p>
           <w:p>
             <w:pPr>
@@ -268,8 +399,13 @@
               <w:t>Creating starter database for testing</w:t>
             </w:r>
             <w:r>
-              <w:t>” in the terminal</w:t>
-            </w:r>
+              <w:t xml:space="preserve">” in the </w:t>
+            </w:r>
+            <w:proofErr w:type="gramStart"/>
+            <w:r>
+              <w:t>terminal</w:t>
+            </w:r>
+            <w:proofErr w:type="gramEnd"/>
           </w:p>
           <w:p>
             <w:pPr>
@@ -551,223 +687,233 @@
                 <w:sz w:val="20"/>
                 <w:szCs w:val="20"/>
               </w:rPr>
+              <w:t xml:space="preserve">     14351</w:t>
+            </w:r>
+          </w:p>
+          <w:p>
+            <w:pPr>
+              <w:cnfStyle w:val="000000000000" w:firstRow="0" w:lastRow="0" w:firstColumn="0" w:lastColumn="0" w:oddVBand="0" w:evenVBand="0" w:oddHBand="0" w:evenHBand="0" w:firstRowFirstColumn="0" w:firstRowLastColumn="0" w:lastRowFirstColumn="0" w:lastRowLastColumn="0"/>
+              <w:rPr>
+                <w:rFonts w:ascii="Courier New" w:hAnsi="Courier New" w:cs="Courier New"/>
+                <w:sz w:val="20"/>
+                <w:szCs w:val="20"/>
+              </w:rPr>
+            </w:pPr>
+            <w:r>
+              <w:rPr>
+                <w:rFonts w:ascii="Courier New" w:hAnsi="Courier New" w:cs="Courier New"/>
+                <w:sz w:val="20"/>
+                <w:szCs w:val="20"/>
+              </w:rPr>
+              <w:t xml:space="preserve"> #NAME</w:t>
+            </w:r>
+          </w:p>
+          <w:p>
+            <w:pPr>
+              <w:cnfStyle w:val="000000000000" w:firstRow="0" w:lastRow="0" w:firstColumn="0" w:lastColumn="0" w:oddVBand="0" w:evenVBand="0" w:oddHBand="0" w:evenHBand="0" w:firstRowFirstColumn="0" w:firstRowLastColumn="0" w:lastRowFirstColumn="0" w:lastRowLastColumn="0"/>
+              <w:rPr>
+                <w:rFonts w:ascii="Courier New" w:hAnsi="Courier New" w:cs="Courier New"/>
+                <w:sz w:val="20"/>
+                <w:szCs w:val="20"/>
+              </w:rPr>
+            </w:pPr>
+            <w:r>
+              <w:rPr>
+                <w:rFonts w:ascii="Courier New" w:hAnsi="Courier New" w:cs="Courier New"/>
+                <w:sz w:val="20"/>
+                <w:szCs w:val="20"/>
+              </w:rPr>
+              <w:t xml:space="preserve">     Bee </w:t>
+            </w:r>
+            <w:proofErr w:type="spellStart"/>
+            <w:r>
+              <w:rPr>
+                <w:rFonts w:ascii="Courier New" w:hAnsi="Courier New" w:cs="Courier New"/>
+                <w:sz w:val="20"/>
+                <w:szCs w:val="20"/>
+              </w:rPr>
+              <w:t>Hyve</w:t>
+            </w:r>
+            <w:proofErr w:type="spellEnd"/>
+          </w:p>
+          <w:p>
+            <w:pPr>
+              <w:cnfStyle w:val="000000000000" w:firstRow="0" w:lastRow="0" w:firstColumn="0" w:lastColumn="0" w:oddVBand="0" w:evenVBand="0" w:oddHBand="0" w:evenHBand="0" w:firstRowFirstColumn="0" w:firstRowLastColumn="0" w:lastRowFirstColumn="0" w:lastRowLastColumn="0"/>
+              <w:rPr>
+                <w:rFonts w:ascii="Courier New" w:hAnsi="Courier New" w:cs="Courier New"/>
+                <w:sz w:val="20"/>
+                <w:szCs w:val="20"/>
+              </w:rPr>
+            </w:pPr>
+            <w:r>
+              <w:rPr>
+                <w:rFonts w:ascii="Courier New" w:hAnsi="Courier New" w:cs="Courier New"/>
+                <w:sz w:val="20"/>
+                <w:szCs w:val="20"/>
+              </w:rPr>
+              <w:t xml:space="preserve"> #ENROLLMENTS</w:t>
+            </w:r>
+          </w:p>
+          <w:p>
+            <w:pPr>
+              <w:cnfStyle w:val="000000000000" w:firstRow="0" w:lastRow="0" w:firstColumn="0" w:lastColumn="0" w:oddVBand="0" w:evenVBand="0" w:oddHBand="0" w:evenHBand="0" w:firstRowFirstColumn="0" w:firstRowLastColumn="0" w:lastRowFirstColumn="0" w:lastRowLastColumn="0"/>
+              <w:rPr>
+                <w:rFonts w:ascii="Courier New" w:hAnsi="Courier New" w:cs="Courier New"/>
+                <w:sz w:val="20"/>
+                <w:szCs w:val="20"/>
+              </w:rPr>
+            </w:pPr>
+            <w:r>
+              <w:rPr>
+                <w:rFonts w:ascii="Courier New" w:hAnsi="Courier New" w:cs="Courier New"/>
+                <w:sz w:val="20"/>
+                <w:szCs w:val="20"/>
+              </w:rPr>
+              <w:t xml:space="preserve">     COMP101 COMP102 COMP105 COMP110 COMP155 COMP165</w:t>
+            </w:r>
+          </w:p>
+          <w:p>
+            <w:pPr>
+              <w:cnfStyle w:val="000000000000" w:firstRow="0" w:lastRow="0" w:firstColumn="0" w:lastColumn="0" w:oddVBand="0" w:evenVBand="0" w:oddHBand="0" w:evenHBand="0" w:firstRowFirstColumn="0" w:firstRowLastColumn="0" w:lastRowFirstColumn="0" w:lastRowLastColumn="0"/>
+              <w:rPr>
+                <w:rFonts w:ascii="Courier New" w:hAnsi="Courier New" w:cs="Courier New"/>
+                <w:sz w:val="20"/>
+                <w:szCs w:val="20"/>
+              </w:rPr>
+            </w:pPr>
+            <w:r>
+              <w:rPr>
+                <w:rFonts w:ascii="Courier New" w:hAnsi="Courier New" w:cs="Courier New"/>
+                <w:sz w:val="20"/>
+                <w:szCs w:val="20"/>
+              </w:rPr>
+              <w:t xml:space="preserve"> #GRADES</w:t>
+            </w:r>
+          </w:p>
+          <w:p>
+            <w:pPr>
+              <w:cnfStyle w:val="000000000000" w:firstRow="0" w:lastRow="0" w:firstColumn="0" w:lastColumn="0" w:oddVBand="0" w:evenVBand="0" w:oddHBand="0" w:evenHBand="0" w:firstRowFirstColumn="0" w:firstRowLastColumn="0" w:lastRowFirstColumn="0" w:lastRowLastColumn="0"/>
+              <w:rPr>
+                <w:rFonts w:ascii="Courier New" w:hAnsi="Courier New" w:cs="Courier New"/>
+                <w:sz w:val="20"/>
+                <w:szCs w:val="20"/>
+              </w:rPr>
+            </w:pPr>
+            <w:r>
+              <w:rPr>
+                <w:rFonts w:ascii="Courier New" w:hAnsi="Courier New" w:cs="Courier New"/>
+                <w:sz w:val="20"/>
+                <w:szCs w:val="20"/>
+              </w:rPr>
+              <w:t xml:space="preserve">     84.3 54.7 91.4 80.4 40.5 67.5</w:t>
+            </w:r>
+          </w:p>
+          <w:p>
+            <w:pPr>
+              <w:cnfStyle w:val="000000000000" w:firstRow="0" w:lastRow="0" w:firstColumn="0" w:lastColumn="0" w:oddVBand="0" w:evenVBand="0" w:oddHBand="0" w:evenHBand="0" w:firstRowFirstColumn="0" w:firstRowLastColumn="0" w:lastRowFirstColumn="0" w:lastRowLastColumn="0"/>
+              <w:rPr>
+                <w:rFonts w:ascii="Courier New" w:hAnsi="Courier New" w:cs="Courier New"/>
+                <w:sz w:val="20"/>
+                <w:szCs w:val="20"/>
+              </w:rPr>
+            </w:pPr>
+            <w:r>
+              <w:rPr>
+                <w:rFonts w:ascii="Courier New" w:hAnsi="Courier New" w:cs="Courier New"/>
+                <w:sz w:val="20"/>
+                <w:szCs w:val="20"/>
+              </w:rPr>
+              <w:t xml:space="preserve"> </w:t>
+            </w:r>
+          </w:p>
+          <w:p>
+            <w:pPr>
+              <w:cnfStyle w:val="000000000000" w:firstRow="0" w:lastRow="0" w:firstColumn="0" w:lastColumn="0" w:oddVBand="0" w:evenVBand="0" w:oddHBand="0" w:evenHBand="0" w:firstRowFirstColumn="0" w:firstRowLastColumn="0" w:lastRowFirstColumn="0" w:lastRowLastColumn="0"/>
+              <w:rPr>
+                <w:rFonts w:ascii="Courier New" w:hAnsi="Courier New" w:cs="Courier New"/>
+                <w:sz w:val="20"/>
+                <w:szCs w:val="20"/>
+              </w:rPr>
+            </w:pPr>
+            <w:r>
+              <w:rPr>
+                <w:rFonts w:ascii="Courier New" w:hAnsi="Courier New" w:cs="Courier New"/>
+                <w:sz w:val="20"/>
+                <w:szCs w:val="20"/>
+              </w:rPr>
+              <w:t>#RECORD</w:t>
+            </w:r>
+          </w:p>
+          <w:p>
+            <w:pPr>
+              <w:cnfStyle w:val="000000000000" w:firstRow="0" w:lastRow="0" w:firstColumn="0" w:lastColumn="0" w:oddVBand="0" w:evenVBand="0" w:oddHBand="0" w:evenHBand="0" w:firstRowFirstColumn="0" w:firstRowLastColumn="0" w:lastRowFirstColumn="0" w:lastRowLastColumn="0"/>
+              <w:rPr>
+                <w:rFonts w:ascii="Courier New" w:hAnsi="Courier New" w:cs="Courier New"/>
+                <w:sz w:val="20"/>
+                <w:szCs w:val="20"/>
+              </w:rPr>
+            </w:pPr>
+            <w:r>
+              <w:rPr>
+                <w:rFonts w:ascii="Courier New" w:hAnsi="Courier New" w:cs="Courier New"/>
+                <w:sz w:val="20"/>
+                <w:szCs w:val="20"/>
+              </w:rPr>
+              <w:t xml:space="preserve"> #NAME</w:t>
+            </w:r>
+          </w:p>
+          <w:p>
+            <w:pPr>
+              <w:cnfStyle w:val="000000000000" w:firstRow="0" w:lastRow="0" w:firstColumn="0" w:lastColumn="0" w:oddVBand="0" w:evenVBand="0" w:oddHBand="0" w:evenHBand="0" w:firstRowFirstColumn="0" w:firstRowLastColumn="0" w:lastRowFirstColumn="0" w:lastRowLastColumn="0"/>
+              <w:rPr>
+                <w:rFonts w:ascii="Courier New" w:hAnsi="Courier New" w:cs="Courier New"/>
+                <w:sz w:val="20"/>
+                <w:szCs w:val="20"/>
+              </w:rPr>
+            </w:pPr>
+            <w:r>
+              <w:rPr>
+                <w:rFonts w:ascii="Courier New" w:hAnsi="Courier New" w:cs="Courier New"/>
+                <w:sz w:val="20"/>
+                <w:szCs w:val="20"/>
+              </w:rPr>
+              <w:t xml:space="preserve">     Gee Rafferty</w:t>
+            </w:r>
+          </w:p>
+          <w:p>
+            <w:pPr>
+              <w:cnfStyle w:val="000000000000" w:firstRow="0" w:lastRow="0" w:firstColumn="0" w:lastColumn="0" w:oddVBand="0" w:evenVBand="0" w:oddHBand="0" w:evenHBand="0" w:firstRowFirstColumn="0" w:firstRowLastColumn="0" w:lastRowFirstColumn="0" w:lastRowLastColumn="0"/>
+              <w:rPr>
+                <w:rFonts w:ascii="Courier New" w:hAnsi="Courier New" w:cs="Courier New"/>
+                <w:sz w:val="20"/>
+                <w:szCs w:val="20"/>
+              </w:rPr>
+            </w:pPr>
+            <w:r>
+              <w:rPr>
+                <w:rFonts w:ascii="Courier New" w:hAnsi="Courier New" w:cs="Courier New"/>
+                <w:sz w:val="20"/>
+                <w:szCs w:val="20"/>
+              </w:rPr>
+              <w:t xml:space="preserve"> #ENROLLMENTS</w:t>
+            </w:r>
+          </w:p>
+          <w:p>
+            <w:pPr>
+              <w:cnfStyle w:val="000000000000" w:firstRow="0" w:lastRow="0" w:firstColumn="0" w:lastColumn="0" w:oddVBand="0" w:evenVBand="0" w:oddHBand="0" w:evenHBand="0" w:firstRowFirstColumn="0" w:firstRowLastColumn="0" w:lastRowFirstColumn="0" w:lastRowLastColumn="0"/>
+              <w:rPr>
+                <w:rFonts w:ascii="Courier New" w:hAnsi="Courier New" w:cs="Courier New"/>
+                <w:sz w:val="20"/>
+                <w:szCs w:val="20"/>
+              </w:rPr>
+            </w:pPr>
+            <w:r>
+              <w:rPr>
+                <w:rFonts w:ascii="Courier New" w:hAnsi="Courier New" w:cs="Courier New"/>
+                <w:sz w:val="20"/>
+                <w:szCs w:val="20"/>
+              </w:rPr>
               <w:lastRenderedPageBreak/>
-              <w:t xml:space="preserve">     14351</w:t>
-            </w:r>
-          </w:p>
-          <w:p>
-            <w:pPr>
-              <w:cnfStyle w:val="000000000000" w:firstRow="0" w:lastRow="0" w:firstColumn="0" w:lastColumn="0" w:oddVBand="0" w:evenVBand="0" w:oddHBand="0" w:evenHBand="0" w:firstRowFirstColumn="0" w:firstRowLastColumn="0" w:lastRowFirstColumn="0" w:lastRowLastColumn="0"/>
-              <w:rPr>
-                <w:rFonts w:ascii="Courier New" w:hAnsi="Courier New" w:cs="Courier New"/>
-                <w:sz w:val="20"/>
-                <w:szCs w:val="20"/>
-              </w:rPr>
-            </w:pPr>
-            <w:r>
-              <w:rPr>
-                <w:rFonts w:ascii="Courier New" w:hAnsi="Courier New" w:cs="Courier New"/>
-                <w:sz w:val="20"/>
-                <w:szCs w:val="20"/>
-              </w:rPr>
-              <w:t xml:space="preserve"> #NAME</w:t>
-            </w:r>
-          </w:p>
-          <w:p>
-            <w:pPr>
-              <w:cnfStyle w:val="000000000000" w:firstRow="0" w:lastRow="0" w:firstColumn="0" w:lastColumn="0" w:oddVBand="0" w:evenVBand="0" w:oddHBand="0" w:evenHBand="0" w:firstRowFirstColumn="0" w:firstRowLastColumn="0" w:lastRowFirstColumn="0" w:lastRowLastColumn="0"/>
-              <w:rPr>
-                <w:rFonts w:ascii="Courier New" w:hAnsi="Courier New" w:cs="Courier New"/>
-                <w:sz w:val="20"/>
-                <w:szCs w:val="20"/>
-              </w:rPr>
-            </w:pPr>
-            <w:r>
-              <w:rPr>
-                <w:rFonts w:ascii="Courier New" w:hAnsi="Courier New" w:cs="Courier New"/>
-                <w:sz w:val="20"/>
-                <w:szCs w:val="20"/>
-              </w:rPr>
-              <w:t xml:space="preserve">     Bee Hyve</w:t>
-            </w:r>
-          </w:p>
-          <w:p>
-            <w:pPr>
-              <w:cnfStyle w:val="000000000000" w:firstRow="0" w:lastRow="0" w:firstColumn="0" w:lastColumn="0" w:oddVBand="0" w:evenVBand="0" w:oddHBand="0" w:evenHBand="0" w:firstRowFirstColumn="0" w:firstRowLastColumn="0" w:lastRowFirstColumn="0" w:lastRowLastColumn="0"/>
-              <w:rPr>
-                <w:rFonts w:ascii="Courier New" w:hAnsi="Courier New" w:cs="Courier New"/>
-                <w:sz w:val="20"/>
-                <w:szCs w:val="20"/>
-              </w:rPr>
-            </w:pPr>
-            <w:r>
-              <w:rPr>
-                <w:rFonts w:ascii="Courier New" w:hAnsi="Courier New" w:cs="Courier New"/>
-                <w:sz w:val="20"/>
-                <w:szCs w:val="20"/>
-              </w:rPr>
-              <w:t xml:space="preserve"> #ENROLLMENTS</w:t>
-            </w:r>
-          </w:p>
-          <w:p>
-            <w:pPr>
-              <w:cnfStyle w:val="000000000000" w:firstRow="0" w:lastRow="0" w:firstColumn="0" w:lastColumn="0" w:oddVBand="0" w:evenVBand="0" w:oddHBand="0" w:evenHBand="0" w:firstRowFirstColumn="0" w:firstRowLastColumn="0" w:lastRowFirstColumn="0" w:lastRowLastColumn="0"/>
-              <w:rPr>
-                <w:rFonts w:ascii="Courier New" w:hAnsi="Courier New" w:cs="Courier New"/>
-                <w:sz w:val="20"/>
-                <w:szCs w:val="20"/>
-              </w:rPr>
-            </w:pPr>
-            <w:r>
-              <w:rPr>
-                <w:rFonts w:ascii="Courier New" w:hAnsi="Courier New" w:cs="Courier New"/>
-                <w:sz w:val="20"/>
-                <w:szCs w:val="20"/>
-              </w:rPr>
-              <w:t xml:space="preserve">     COMP101 COMP102 COMP105 COMP110 COMP155 COMP165</w:t>
-            </w:r>
-          </w:p>
-          <w:p>
-            <w:pPr>
-              <w:cnfStyle w:val="000000000000" w:firstRow="0" w:lastRow="0" w:firstColumn="0" w:lastColumn="0" w:oddVBand="0" w:evenVBand="0" w:oddHBand="0" w:evenHBand="0" w:firstRowFirstColumn="0" w:firstRowLastColumn="0" w:lastRowFirstColumn="0" w:lastRowLastColumn="0"/>
-              <w:rPr>
-                <w:rFonts w:ascii="Courier New" w:hAnsi="Courier New" w:cs="Courier New"/>
-                <w:sz w:val="20"/>
-                <w:szCs w:val="20"/>
-              </w:rPr>
-            </w:pPr>
-            <w:r>
-              <w:rPr>
-                <w:rFonts w:ascii="Courier New" w:hAnsi="Courier New" w:cs="Courier New"/>
-                <w:sz w:val="20"/>
-                <w:szCs w:val="20"/>
-              </w:rPr>
-              <w:t xml:space="preserve"> #GRADES</w:t>
-            </w:r>
-          </w:p>
-          <w:p>
-            <w:pPr>
-              <w:cnfStyle w:val="000000000000" w:firstRow="0" w:lastRow="0" w:firstColumn="0" w:lastColumn="0" w:oddVBand="0" w:evenVBand="0" w:oddHBand="0" w:evenHBand="0" w:firstRowFirstColumn="0" w:firstRowLastColumn="0" w:lastRowFirstColumn="0" w:lastRowLastColumn="0"/>
-              <w:rPr>
-                <w:rFonts w:ascii="Courier New" w:hAnsi="Courier New" w:cs="Courier New"/>
-                <w:sz w:val="20"/>
-                <w:szCs w:val="20"/>
-              </w:rPr>
-            </w:pPr>
-            <w:r>
-              <w:rPr>
-                <w:rFonts w:ascii="Courier New" w:hAnsi="Courier New" w:cs="Courier New"/>
-                <w:sz w:val="20"/>
-                <w:szCs w:val="20"/>
-              </w:rPr>
-              <w:t xml:space="preserve">     84.3 54.7 91.4 80.4 40.5 67.5</w:t>
-            </w:r>
-          </w:p>
-          <w:p>
-            <w:pPr>
-              <w:cnfStyle w:val="000000000000" w:firstRow="0" w:lastRow="0" w:firstColumn="0" w:lastColumn="0" w:oddVBand="0" w:evenVBand="0" w:oddHBand="0" w:evenHBand="0" w:firstRowFirstColumn="0" w:firstRowLastColumn="0" w:lastRowFirstColumn="0" w:lastRowLastColumn="0"/>
-              <w:rPr>
-                <w:rFonts w:ascii="Courier New" w:hAnsi="Courier New" w:cs="Courier New"/>
-                <w:sz w:val="20"/>
-                <w:szCs w:val="20"/>
-              </w:rPr>
-            </w:pPr>
-            <w:r>
-              <w:rPr>
-                <w:rFonts w:ascii="Courier New" w:hAnsi="Courier New" w:cs="Courier New"/>
-                <w:sz w:val="20"/>
-                <w:szCs w:val="20"/>
-              </w:rPr>
-              <w:t xml:space="preserve"> </w:t>
-            </w:r>
-          </w:p>
-          <w:p>
-            <w:pPr>
-              <w:cnfStyle w:val="000000000000" w:firstRow="0" w:lastRow="0" w:firstColumn="0" w:lastColumn="0" w:oddVBand="0" w:evenVBand="0" w:oddHBand="0" w:evenHBand="0" w:firstRowFirstColumn="0" w:firstRowLastColumn="0" w:lastRowFirstColumn="0" w:lastRowLastColumn="0"/>
-              <w:rPr>
-                <w:rFonts w:ascii="Courier New" w:hAnsi="Courier New" w:cs="Courier New"/>
-                <w:sz w:val="20"/>
-                <w:szCs w:val="20"/>
-              </w:rPr>
-            </w:pPr>
-            <w:r>
-              <w:rPr>
-                <w:rFonts w:ascii="Courier New" w:hAnsi="Courier New" w:cs="Courier New"/>
-                <w:sz w:val="20"/>
-                <w:szCs w:val="20"/>
-              </w:rPr>
-              <w:t>#RECORD</w:t>
-            </w:r>
-          </w:p>
-          <w:p>
-            <w:pPr>
-              <w:cnfStyle w:val="000000000000" w:firstRow="0" w:lastRow="0" w:firstColumn="0" w:lastColumn="0" w:oddVBand="0" w:evenVBand="0" w:oddHBand="0" w:evenHBand="0" w:firstRowFirstColumn="0" w:firstRowLastColumn="0" w:lastRowFirstColumn="0" w:lastRowLastColumn="0"/>
-              <w:rPr>
-                <w:rFonts w:ascii="Courier New" w:hAnsi="Courier New" w:cs="Courier New"/>
-                <w:sz w:val="20"/>
-                <w:szCs w:val="20"/>
-              </w:rPr>
-            </w:pPr>
-            <w:r>
-              <w:rPr>
-                <w:rFonts w:ascii="Courier New" w:hAnsi="Courier New" w:cs="Courier New"/>
-                <w:sz w:val="20"/>
-                <w:szCs w:val="20"/>
-              </w:rPr>
-              <w:t xml:space="preserve"> #NAME</w:t>
-            </w:r>
-          </w:p>
-          <w:p>
-            <w:pPr>
-              <w:cnfStyle w:val="000000000000" w:firstRow="0" w:lastRow="0" w:firstColumn="0" w:lastColumn="0" w:oddVBand="0" w:evenVBand="0" w:oddHBand="0" w:evenHBand="0" w:firstRowFirstColumn="0" w:firstRowLastColumn="0" w:lastRowFirstColumn="0" w:lastRowLastColumn="0"/>
-              <w:rPr>
-                <w:rFonts w:ascii="Courier New" w:hAnsi="Courier New" w:cs="Courier New"/>
-                <w:sz w:val="20"/>
-                <w:szCs w:val="20"/>
-              </w:rPr>
-            </w:pPr>
-            <w:r>
-              <w:rPr>
-                <w:rFonts w:ascii="Courier New" w:hAnsi="Courier New" w:cs="Courier New"/>
-                <w:sz w:val="20"/>
-                <w:szCs w:val="20"/>
-              </w:rPr>
-              <w:t xml:space="preserve">     Gee Rafferty</w:t>
-            </w:r>
-          </w:p>
-          <w:p>
-            <w:pPr>
-              <w:cnfStyle w:val="000000000000" w:firstRow="0" w:lastRow="0" w:firstColumn="0" w:lastColumn="0" w:oddVBand="0" w:evenVBand="0" w:oddHBand="0" w:evenHBand="0" w:firstRowFirstColumn="0" w:firstRowLastColumn="0" w:lastRowFirstColumn="0" w:lastRowLastColumn="0"/>
-              <w:rPr>
-                <w:rFonts w:ascii="Courier New" w:hAnsi="Courier New" w:cs="Courier New"/>
-                <w:sz w:val="20"/>
-                <w:szCs w:val="20"/>
-              </w:rPr>
-            </w:pPr>
-            <w:r>
-              <w:rPr>
-                <w:rFonts w:ascii="Courier New" w:hAnsi="Courier New" w:cs="Courier New"/>
-                <w:sz w:val="20"/>
-                <w:szCs w:val="20"/>
-              </w:rPr>
-              <w:t xml:space="preserve"> #ENROLLMENTS</w:t>
-            </w:r>
-          </w:p>
-          <w:p>
-            <w:pPr>
-              <w:cnfStyle w:val="000000000000" w:firstRow="0" w:lastRow="0" w:firstColumn="0" w:lastColumn="0" w:oddVBand="0" w:evenVBand="0" w:oddHBand="0" w:evenHBand="0" w:firstRowFirstColumn="0" w:firstRowLastColumn="0" w:lastRowFirstColumn="0" w:lastRowLastColumn="0"/>
-              <w:rPr>
-                <w:rFonts w:ascii="Courier New" w:hAnsi="Courier New" w:cs="Courier New"/>
-                <w:sz w:val="20"/>
-                <w:szCs w:val="20"/>
-              </w:rPr>
-            </w:pPr>
-            <w:r>
-              <w:rPr>
-                <w:rFonts w:ascii="Courier New" w:hAnsi="Courier New" w:cs="Courier New"/>
-                <w:sz w:val="20"/>
-                <w:szCs w:val="20"/>
-              </w:rPr>
               <w:t xml:space="preserve">     ELEC101 ELEC133 COMP101 PROJ101 GIT101</w:t>
             </w:r>
           </w:p>
@@ -917,8 +1063,36 @@
                 <w:b w:val="0"/>
                 <w:bCs w:val="0"/>
               </w:rPr>
-              <w:t>-db computing.txt -showAll</w:t>
-            </w:r>
+              <w:t>-</w:t>
+            </w:r>
+            <w:proofErr w:type="spellStart"/>
+            <w:r>
+              <w:rPr>
+                <w:rFonts w:ascii="Courier New" w:hAnsi="Courier New" w:cs="Courier New"/>
+                <w:b w:val="0"/>
+                <w:bCs w:val="0"/>
+              </w:rPr>
+              <w:t>db</w:t>
+            </w:r>
+            <w:proofErr w:type="spellEnd"/>
+            <w:r>
+              <w:rPr>
+                <w:rFonts w:ascii="Courier New" w:hAnsi="Courier New" w:cs="Courier New"/>
+                <w:b w:val="0"/>
+                <w:bCs w:val="0"/>
+              </w:rPr>
+              <w:t xml:space="preserve"> computing.txt -</w:t>
+            </w:r>
+            <w:proofErr w:type="spellStart"/>
+            <w:r>
+              <w:rPr>
+                <w:rFonts w:ascii="Courier New" w:hAnsi="Courier New" w:cs="Courier New"/>
+                <w:b w:val="0"/>
+                <w:bCs w:val="0"/>
+              </w:rPr>
+              <w:t>showAll</w:t>
+            </w:r>
+            <w:proofErr w:type="spellEnd"/>
           </w:p>
         </w:tc>
         <w:tc>
@@ -1052,8 +1226,13 @@
               <w:cnfStyle w:val="000000000000" w:firstRow="0" w:lastRow="0" w:firstColumn="0" w:lastColumn="0" w:oddVBand="0" w:evenVBand="0" w:oddHBand="0" w:evenHBand="0" w:firstRowFirstColumn="0" w:firstRowLastColumn="0" w:lastRowFirstColumn="0" w:lastRowLastColumn="0"/>
             </w:pPr>
             <w:r>
-              <w:t xml:space="preserve">   Bee Hyve</w:t>
-            </w:r>
+              <w:t xml:space="preserve">   Bee </w:t>
+            </w:r>
+            <w:proofErr w:type="spellStart"/>
+            <w:r>
+              <w:t>Hyve</w:t>
+            </w:r>
+            <w:proofErr w:type="spellEnd"/>
           </w:p>
           <w:p>
             <w:pPr>
@@ -1068,84 +1247,84 @@
               <w:cnfStyle w:val="000000000000" w:firstRow="0" w:lastRow="0" w:firstColumn="0" w:lastColumn="0" w:oddVBand="0" w:evenVBand="0" w:oddHBand="0" w:evenHBand="0" w:firstRowFirstColumn="0" w:firstRowLastColumn="0" w:lastRowFirstColumn="0" w:lastRowLastColumn="0"/>
             </w:pPr>
             <w:r>
+              <w:t xml:space="preserve">   COMP101 COMP102 COMP105 COMP110 COMP155 COMP165 </w:t>
+            </w:r>
+          </w:p>
+          <w:p>
+            <w:pPr>
+              <w:cnfStyle w:val="000000000000" w:firstRow="0" w:lastRow="0" w:firstColumn="0" w:lastColumn="0" w:oddVBand="0" w:evenVBand="0" w:oddHBand="0" w:evenHBand="0" w:firstRowFirstColumn="0" w:firstRowLastColumn="0" w:lastRowFirstColumn="0" w:lastRowLastColumn="0"/>
+            </w:pPr>
+            <w:r>
+              <w:t>GRADES:</w:t>
+            </w:r>
+          </w:p>
+          <w:p>
+            <w:pPr>
+              <w:cnfStyle w:val="000000000000" w:firstRow="0" w:lastRow="0" w:firstColumn="0" w:lastColumn="0" w:oddVBand="0" w:evenVBand="0" w:oddHBand="0" w:evenHBand="0" w:firstRowFirstColumn="0" w:firstRowLastColumn="0" w:lastRowFirstColumn="0" w:lastRowLastColumn="0"/>
+            </w:pPr>
+            <w:r>
+              <w:t xml:space="preserve">   84.3 54.7 91.4 80.4 40.5 67.5 </w:t>
+            </w:r>
+          </w:p>
+          <w:p>
+            <w:pPr>
+              <w:cnfStyle w:val="000000000000" w:firstRow="0" w:lastRow="0" w:firstColumn="0" w:lastColumn="0" w:oddVBand="0" w:evenVBand="0" w:oddHBand="0" w:evenHBand="0" w:firstRowFirstColumn="0" w:firstRowLastColumn="0" w:lastRowFirstColumn="0" w:lastRowLastColumn="0"/>
+            </w:pPr>
+          </w:p>
+          <w:p>
+            <w:pPr>
+              <w:cnfStyle w:val="000000000000" w:firstRow="0" w:lastRow="0" w:firstColumn="0" w:lastColumn="0" w:oddVBand="0" w:evenVBand="0" w:oddHBand="0" w:evenHBand="0" w:firstRowFirstColumn="0" w:firstRowLastColumn="0" w:lastRowFirstColumn="0" w:lastRowLastColumn="0"/>
+            </w:pPr>
+            <w:r>
+              <w:t>SID:</w:t>
+            </w:r>
+          </w:p>
+          <w:p>
+            <w:pPr>
+              <w:cnfStyle w:val="000000000000" w:firstRow="0" w:lastRow="0" w:firstColumn="0" w:lastColumn="0" w:oddVBand="0" w:evenVBand="0" w:oddHBand="0" w:evenHBand="0" w:firstRowFirstColumn="0" w:firstRowLastColumn="0" w:lastRowFirstColumn="0" w:lastRowLastColumn="0"/>
+            </w:pPr>
+            <w:r>
+              <w:t xml:space="preserve">   15309</w:t>
+            </w:r>
+          </w:p>
+          <w:p>
+            <w:pPr>
+              <w:cnfStyle w:val="000000000000" w:firstRow="0" w:lastRow="0" w:firstColumn="0" w:lastColumn="0" w:oddVBand="0" w:evenVBand="0" w:oddHBand="0" w:evenHBand="0" w:firstRowFirstColumn="0" w:firstRowLastColumn="0" w:lastRowFirstColumn="0" w:lastRowLastColumn="0"/>
+            </w:pPr>
+            <w:r>
+              <w:t>NAME:</w:t>
+            </w:r>
+          </w:p>
+          <w:p>
+            <w:pPr>
+              <w:cnfStyle w:val="000000000000" w:firstRow="0" w:lastRow="0" w:firstColumn="0" w:lastColumn="0" w:oddVBand="0" w:evenVBand="0" w:oddHBand="0" w:evenHBand="0" w:firstRowFirstColumn="0" w:firstRowLastColumn="0" w:lastRowFirstColumn="0" w:lastRowLastColumn="0"/>
+            </w:pPr>
+            <w:r>
+              <w:t xml:space="preserve">   Gee Rafferty</w:t>
+            </w:r>
+          </w:p>
+          <w:p>
+            <w:pPr>
+              <w:cnfStyle w:val="000000000000" w:firstRow="0" w:lastRow="0" w:firstColumn="0" w:lastColumn="0" w:oddVBand="0" w:evenVBand="0" w:oddHBand="0" w:evenHBand="0" w:firstRowFirstColumn="0" w:firstRowLastColumn="0" w:lastRowFirstColumn="0" w:lastRowLastColumn="0"/>
+            </w:pPr>
+            <w:r>
+              <w:t>ENROLLMENTS:</w:t>
+            </w:r>
+          </w:p>
+          <w:p>
+            <w:pPr>
+              <w:cnfStyle w:val="000000000000" w:firstRow="0" w:lastRow="0" w:firstColumn="0" w:lastColumn="0" w:oddVBand="0" w:evenVBand="0" w:oddHBand="0" w:evenHBand="0" w:firstRowFirstColumn="0" w:firstRowLastColumn="0" w:lastRowFirstColumn="0" w:lastRowLastColumn="0"/>
+            </w:pPr>
+            <w:r>
+              <w:t xml:space="preserve">   ELEC101 ELEC133 COMP101 PROJ101 GIT101 </w:t>
+            </w:r>
+          </w:p>
+          <w:p>
+            <w:pPr>
+              <w:cnfStyle w:val="000000000000" w:firstRow="0" w:lastRow="0" w:firstColumn="0" w:lastColumn="0" w:oddVBand="0" w:evenVBand="0" w:oddHBand="0" w:evenHBand="0" w:firstRowFirstColumn="0" w:firstRowLastColumn="0" w:lastRowFirstColumn="0" w:lastRowLastColumn="0"/>
+            </w:pPr>
+            <w:r>
               <w:lastRenderedPageBreak/>
-              <w:t xml:space="preserve">   COMP101 COMP102 COMP105 COMP110 COMP155 COMP165 </w:t>
-            </w:r>
-          </w:p>
-          <w:p>
-            <w:pPr>
-              <w:cnfStyle w:val="000000000000" w:firstRow="0" w:lastRow="0" w:firstColumn="0" w:lastColumn="0" w:oddVBand="0" w:evenVBand="0" w:oddHBand="0" w:evenHBand="0" w:firstRowFirstColumn="0" w:firstRowLastColumn="0" w:lastRowFirstColumn="0" w:lastRowLastColumn="0"/>
-            </w:pPr>
-            <w:r>
-              <w:t>GRADES:</w:t>
-            </w:r>
-          </w:p>
-          <w:p>
-            <w:pPr>
-              <w:cnfStyle w:val="000000000000" w:firstRow="0" w:lastRow="0" w:firstColumn="0" w:lastColumn="0" w:oddVBand="0" w:evenVBand="0" w:oddHBand="0" w:evenHBand="0" w:firstRowFirstColumn="0" w:firstRowLastColumn="0" w:lastRowFirstColumn="0" w:lastRowLastColumn="0"/>
-            </w:pPr>
-            <w:r>
-              <w:t xml:space="preserve">   84.3 54.7 91.4 80.4 40.5 67.5 </w:t>
-            </w:r>
-          </w:p>
-          <w:p>
-            <w:pPr>
-              <w:cnfStyle w:val="000000000000" w:firstRow="0" w:lastRow="0" w:firstColumn="0" w:lastColumn="0" w:oddVBand="0" w:evenVBand="0" w:oddHBand="0" w:evenHBand="0" w:firstRowFirstColumn="0" w:firstRowLastColumn="0" w:lastRowFirstColumn="0" w:lastRowLastColumn="0"/>
-            </w:pPr>
-          </w:p>
-          <w:p>
-            <w:pPr>
-              <w:cnfStyle w:val="000000000000" w:firstRow="0" w:lastRow="0" w:firstColumn="0" w:lastColumn="0" w:oddVBand="0" w:evenVBand="0" w:oddHBand="0" w:evenHBand="0" w:firstRowFirstColumn="0" w:firstRowLastColumn="0" w:lastRowFirstColumn="0" w:lastRowLastColumn="0"/>
-            </w:pPr>
-            <w:r>
-              <w:t>SID:</w:t>
-            </w:r>
-          </w:p>
-          <w:p>
-            <w:pPr>
-              <w:cnfStyle w:val="000000000000" w:firstRow="0" w:lastRow="0" w:firstColumn="0" w:lastColumn="0" w:oddVBand="0" w:evenVBand="0" w:oddHBand="0" w:evenHBand="0" w:firstRowFirstColumn="0" w:firstRowLastColumn="0" w:lastRowFirstColumn="0" w:lastRowLastColumn="0"/>
-            </w:pPr>
-            <w:r>
-              <w:t xml:space="preserve">   15309</w:t>
-            </w:r>
-          </w:p>
-          <w:p>
-            <w:pPr>
-              <w:cnfStyle w:val="000000000000" w:firstRow="0" w:lastRow="0" w:firstColumn="0" w:lastColumn="0" w:oddVBand="0" w:evenVBand="0" w:oddHBand="0" w:evenHBand="0" w:firstRowFirstColumn="0" w:firstRowLastColumn="0" w:lastRowFirstColumn="0" w:lastRowLastColumn="0"/>
-            </w:pPr>
-            <w:r>
-              <w:t>NAME:</w:t>
-            </w:r>
-          </w:p>
-          <w:p>
-            <w:pPr>
-              <w:cnfStyle w:val="000000000000" w:firstRow="0" w:lastRow="0" w:firstColumn="0" w:lastColumn="0" w:oddVBand="0" w:evenVBand="0" w:oddHBand="0" w:evenHBand="0" w:firstRowFirstColumn="0" w:firstRowLastColumn="0" w:lastRowFirstColumn="0" w:lastRowLastColumn="0"/>
-            </w:pPr>
-            <w:r>
-              <w:t xml:space="preserve">   Gee Rafferty</w:t>
-            </w:r>
-          </w:p>
-          <w:p>
-            <w:pPr>
-              <w:cnfStyle w:val="000000000000" w:firstRow="0" w:lastRow="0" w:firstColumn="0" w:lastColumn="0" w:oddVBand="0" w:evenVBand="0" w:oddHBand="0" w:evenHBand="0" w:firstRowFirstColumn="0" w:firstRowLastColumn="0" w:lastRowFirstColumn="0" w:lastRowLastColumn="0"/>
-            </w:pPr>
-            <w:r>
-              <w:t>ENROLLMENTS:</w:t>
-            </w:r>
-          </w:p>
-          <w:p>
-            <w:pPr>
-              <w:cnfStyle w:val="000000000000" w:firstRow="0" w:lastRow="0" w:firstColumn="0" w:lastColumn="0" w:oddVBand="0" w:evenVBand="0" w:oddHBand="0" w:evenHBand="0" w:firstRowFirstColumn="0" w:firstRowLastColumn="0" w:lastRowFirstColumn="0" w:lastRowLastColumn="0"/>
-            </w:pPr>
-            <w:r>
-              <w:t xml:space="preserve">   ELEC101 ELEC133 COMP101 PROJ101 GIT101 </w:t>
-            </w:r>
-          </w:p>
-          <w:p>
-            <w:pPr>
-              <w:cnfStyle w:val="000000000000" w:firstRow="0" w:lastRow="0" w:firstColumn="0" w:lastColumn="0" w:oddVBand="0" w:evenVBand="0" w:oddHBand="0" w:evenHBand="0" w:firstRowFirstColumn="0" w:firstRowLastColumn="0" w:lastRowFirstColumn="0" w:lastRowLastColumn="0"/>
-            </w:pPr>
-            <w:r>
               <w:t>GRADES:</w:t>
             </w:r>
           </w:p>
@@ -1221,7 +1400,43 @@
                 <w:b w:val="0"/>
                 <w:bCs w:val="0"/>
               </w:rPr>
-              <w:t>-db computing.txt -sid 12345</w:t>
+              <w:t>-</w:t>
+            </w:r>
+            <w:proofErr w:type="spellStart"/>
+            <w:r>
+              <w:rPr>
+                <w:rFonts w:ascii="Courier New" w:hAnsi="Courier New" w:cs="Courier New"/>
+                <w:b w:val="0"/>
+                <w:bCs w:val="0"/>
+              </w:rPr>
+              <w:t>db</w:t>
+            </w:r>
+            <w:proofErr w:type="spellEnd"/>
+            <w:r>
+              <w:rPr>
+                <w:rFonts w:ascii="Courier New" w:hAnsi="Courier New" w:cs="Courier New"/>
+                <w:b w:val="0"/>
+                <w:bCs w:val="0"/>
+              </w:rPr>
+              <w:t xml:space="preserve"> computing.txt -</w:t>
+            </w:r>
+            <w:proofErr w:type="spellStart"/>
+            <w:r>
+              <w:rPr>
+                <w:rFonts w:ascii="Courier New" w:hAnsi="Courier New" w:cs="Courier New"/>
+                <w:b w:val="0"/>
+                <w:bCs w:val="0"/>
+              </w:rPr>
+              <w:t>sid</w:t>
+            </w:r>
+            <w:proofErr w:type="spellEnd"/>
+            <w:r>
+              <w:rPr>
+                <w:rFonts w:ascii="Courier New" w:hAnsi="Courier New" w:cs="Courier New"/>
+                <w:b w:val="0"/>
+                <w:bCs w:val="0"/>
+              </w:rPr>
+              <w:t xml:space="preserve"> 12345</w:t>
             </w:r>
           </w:p>
         </w:tc>
@@ -1234,8 +1449,21 @@
               <w:cnfStyle w:val="000000000000" w:firstRow="0" w:lastRow="0" w:firstColumn="0" w:lastColumn="0" w:oddVBand="0" w:evenVBand="0" w:oddHBand="0" w:evenHBand="0" w:firstRowFirstColumn="0" w:firstRowLastColumn="0" w:lastRowFirstColumn="0" w:lastRowLastColumn="0"/>
             </w:pPr>
             <w:r>
-              <w:t>Displays the complete single record with sid equal to 12345</w:t>
-            </w:r>
+              <w:t xml:space="preserve">Displays the complete single record with </w:t>
+            </w:r>
+            <w:proofErr w:type="spellStart"/>
+            <w:r>
+              <w:t>sid</w:t>
+            </w:r>
+            <w:proofErr w:type="spellEnd"/>
+            <w:r>
+              <w:t xml:space="preserve"> equal to </w:t>
+            </w:r>
+            <w:proofErr w:type="gramStart"/>
+            <w:r>
+              <w:t>12345</w:t>
+            </w:r>
+            <w:proofErr w:type="gramEnd"/>
           </w:p>
           <w:p>
             <w:pPr>
@@ -1385,7 +1613,43 @@
                 <w:b w:val="0"/>
                 <w:bCs w:val="0"/>
               </w:rPr>
-              <w:t>-db computing.txt -sid 1234</w:t>
+              <w:t>-</w:t>
+            </w:r>
+            <w:proofErr w:type="spellStart"/>
+            <w:r>
+              <w:rPr>
+                <w:rFonts w:ascii="Courier New" w:hAnsi="Courier New" w:cs="Courier New"/>
+                <w:b w:val="0"/>
+                <w:bCs w:val="0"/>
+              </w:rPr>
+              <w:t>db</w:t>
+            </w:r>
+            <w:proofErr w:type="spellEnd"/>
+            <w:r>
+              <w:rPr>
+                <w:rFonts w:ascii="Courier New" w:hAnsi="Courier New" w:cs="Courier New"/>
+                <w:b w:val="0"/>
+                <w:bCs w:val="0"/>
+              </w:rPr>
+              <w:t xml:space="preserve"> computing.txt -</w:t>
+            </w:r>
+            <w:proofErr w:type="spellStart"/>
+            <w:r>
+              <w:rPr>
+                <w:rFonts w:ascii="Courier New" w:hAnsi="Courier New" w:cs="Courier New"/>
+                <w:b w:val="0"/>
+                <w:bCs w:val="0"/>
+              </w:rPr>
+              <w:t>sid</w:t>
+            </w:r>
+            <w:proofErr w:type="spellEnd"/>
+            <w:r>
+              <w:rPr>
+                <w:rFonts w:ascii="Courier New" w:hAnsi="Courier New" w:cs="Courier New"/>
+                <w:b w:val="0"/>
+                <w:bCs w:val="0"/>
+              </w:rPr>
+              <w:t xml:space="preserve"> 1234</w:t>
             </w:r>
             <w:r>
               <w:rPr>
@@ -1408,7 +1672,43 @@
                 <w:b w:val="0"/>
                 <w:bCs w:val="0"/>
               </w:rPr>
-              <w:t>-db computing.txt -sid 1234</w:t>
+              <w:t>-</w:t>
+            </w:r>
+            <w:proofErr w:type="spellStart"/>
+            <w:r>
+              <w:rPr>
+                <w:rFonts w:ascii="Courier New" w:hAnsi="Courier New" w:cs="Courier New"/>
+                <w:b w:val="0"/>
+                <w:bCs w:val="0"/>
+              </w:rPr>
+              <w:t>db</w:t>
+            </w:r>
+            <w:proofErr w:type="spellEnd"/>
+            <w:r>
+              <w:rPr>
+                <w:rFonts w:ascii="Courier New" w:hAnsi="Courier New" w:cs="Courier New"/>
+                <w:b w:val="0"/>
+                <w:bCs w:val="0"/>
+              </w:rPr>
+              <w:t xml:space="preserve"> computing.txt -</w:t>
+            </w:r>
+            <w:proofErr w:type="spellStart"/>
+            <w:r>
+              <w:rPr>
+                <w:rFonts w:ascii="Courier New" w:hAnsi="Courier New" w:cs="Courier New"/>
+                <w:b w:val="0"/>
+                <w:bCs w:val="0"/>
+              </w:rPr>
+              <w:t>sid</w:t>
+            </w:r>
+            <w:proofErr w:type="spellEnd"/>
+            <w:r>
+              <w:rPr>
+                <w:rFonts w:ascii="Courier New" w:hAnsi="Courier New" w:cs="Courier New"/>
+                <w:b w:val="0"/>
+                <w:bCs w:val="0"/>
+              </w:rPr>
+              <w:t xml:space="preserve"> 1234</w:t>
             </w:r>
             <w:r>
               <w:rPr>
@@ -1431,7 +1731,43 @@
                 <w:b w:val="0"/>
                 <w:bCs w:val="0"/>
               </w:rPr>
-              <w:t>-db computing.txt -sid 1234</w:t>
+              <w:t>-</w:t>
+            </w:r>
+            <w:proofErr w:type="spellStart"/>
+            <w:r>
+              <w:rPr>
+                <w:rFonts w:ascii="Courier New" w:hAnsi="Courier New" w:cs="Courier New"/>
+                <w:b w:val="0"/>
+                <w:bCs w:val="0"/>
+              </w:rPr>
+              <w:t>db</w:t>
+            </w:r>
+            <w:proofErr w:type="spellEnd"/>
+            <w:r>
+              <w:rPr>
+                <w:rFonts w:ascii="Courier New" w:hAnsi="Courier New" w:cs="Courier New"/>
+                <w:b w:val="0"/>
+                <w:bCs w:val="0"/>
+              </w:rPr>
+              <w:t xml:space="preserve"> computing.txt -</w:t>
+            </w:r>
+            <w:proofErr w:type="spellStart"/>
+            <w:r>
+              <w:rPr>
+                <w:rFonts w:ascii="Courier New" w:hAnsi="Courier New" w:cs="Courier New"/>
+                <w:b w:val="0"/>
+                <w:bCs w:val="0"/>
+              </w:rPr>
+              <w:t>sid</w:t>
+            </w:r>
+            <w:proofErr w:type="spellEnd"/>
+            <w:r>
+              <w:rPr>
+                <w:rFonts w:ascii="Courier New" w:hAnsi="Courier New" w:cs="Courier New"/>
+                <w:b w:val="0"/>
+                <w:bCs w:val="0"/>
+              </w:rPr>
+              <w:t xml:space="preserve"> 1234</w:t>
             </w:r>
             <w:r>
               <w:rPr>
@@ -1454,7 +1790,43 @@
                 <w:b w:val="0"/>
                 <w:bCs w:val="0"/>
               </w:rPr>
-              <w:t>-db computing.txt -sid 1234</w:t>
+              <w:t>-</w:t>
+            </w:r>
+            <w:proofErr w:type="spellStart"/>
+            <w:r>
+              <w:rPr>
+                <w:rFonts w:ascii="Courier New" w:hAnsi="Courier New" w:cs="Courier New"/>
+                <w:b w:val="0"/>
+                <w:bCs w:val="0"/>
+              </w:rPr>
+              <w:t>db</w:t>
+            </w:r>
+            <w:proofErr w:type="spellEnd"/>
+            <w:r>
+              <w:rPr>
+                <w:rFonts w:ascii="Courier New" w:hAnsi="Courier New" w:cs="Courier New"/>
+                <w:b w:val="0"/>
+                <w:bCs w:val="0"/>
+              </w:rPr>
+              <w:t xml:space="preserve"> computing.txt -</w:t>
+            </w:r>
+            <w:proofErr w:type="spellStart"/>
+            <w:r>
+              <w:rPr>
+                <w:rFonts w:ascii="Courier New" w:hAnsi="Courier New" w:cs="Courier New"/>
+                <w:b w:val="0"/>
+                <w:bCs w:val="0"/>
+              </w:rPr>
+              <w:t>sid</w:t>
+            </w:r>
+            <w:proofErr w:type="spellEnd"/>
+            <w:r>
+              <w:rPr>
+                <w:rFonts w:ascii="Courier New" w:hAnsi="Courier New" w:cs="Courier New"/>
+                <w:b w:val="0"/>
+                <w:bCs w:val="0"/>
+              </w:rPr>
+              <w:t xml:space="preserve"> 1234</w:t>
             </w:r>
             <w:r>
               <w:rPr>
@@ -1551,7 +1923,43 @@
                 <w:b w:val="0"/>
                 <w:bCs w:val="0"/>
               </w:rPr>
-              <w:t xml:space="preserve">-db computing.txt -sid </w:t>
+              <w:t>-</w:t>
+            </w:r>
+            <w:proofErr w:type="spellStart"/>
+            <w:r>
+              <w:rPr>
+                <w:rFonts w:ascii="Courier New" w:hAnsi="Courier New" w:cs="Courier New"/>
+                <w:b w:val="0"/>
+                <w:bCs w:val="0"/>
+              </w:rPr>
+              <w:t>db</w:t>
+            </w:r>
+            <w:proofErr w:type="spellEnd"/>
+            <w:r>
+              <w:rPr>
+                <w:rFonts w:ascii="Courier New" w:hAnsi="Courier New" w:cs="Courier New"/>
+                <w:b w:val="0"/>
+                <w:bCs w:val="0"/>
+              </w:rPr>
+              <w:t xml:space="preserve"> computing.txt -</w:t>
+            </w:r>
+            <w:proofErr w:type="spellStart"/>
+            <w:r>
+              <w:rPr>
+                <w:rFonts w:ascii="Courier New" w:hAnsi="Courier New" w:cs="Courier New"/>
+                <w:b w:val="0"/>
+                <w:bCs w:val="0"/>
+              </w:rPr>
+              <w:t>sid</w:t>
+            </w:r>
+            <w:proofErr w:type="spellEnd"/>
+            <w:r>
+              <w:rPr>
+                <w:rFonts w:ascii="Courier New" w:hAnsi="Courier New" w:cs="Courier New"/>
+                <w:b w:val="0"/>
+                <w:bCs w:val="0"/>
+              </w:rPr>
+              <w:t xml:space="preserve"> </w:t>
             </w:r>
             <w:r>
               <w:rPr>
@@ -1609,7 +2017,43 @@
                 <w:b w:val="0"/>
                 <w:bCs w:val="0"/>
               </w:rPr>
-              <w:t>-db computing.txt -sid 12345</w:t>
+              <w:t>-</w:t>
+            </w:r>
+            <w:proofErr w:type="spellStart"/>
+            <w:r>
+              <w:rPr>
+                <w:rFonts w:ascii="Courier New" w:hAnsi="Courier New" w:cs="Courier New"/>
+                <w:b w:val="0"/>
+                <w:bCs w:val="0"/>
+              </w:rPr>
+              <w:t>db</w:t>
+            </w:r>
+            <w:proofErr w:type="spellEnd"/>
+            <w:r>
+              <w:rPr>
+                <w:rFonts w:ascii="Courier New" w:hAnsi="Courier New" w:cs="Courier New"/>
+                <w:b w:val="0"/>
+                <w:bCs w:val="0"/>
+              </w:rPr>
+              <w:t xml:space="preserve"> computing.txt -</w:t>
+            </w:r>
+            <w:proofErr w:type="spellStart"/>
+            <w:r>
+              <w:rPr>
+                <w:rFonts w:ascii="Courier New" w:hAnsi="Courier New" w:cs="Courier New"/>
+                <w:b w:val="0"/>
+                <w:bCs w:val="0"/>
+              </w:rPr>
+              <w:t>sid</w:t>
+            </w:r>
+            <w:proofErr w:type="spellEnd"/>
+            <w:r>
+              <w:rPr>
+                <w:rFonts w:ascii="Courier New" w:hAnsi="Courier New" w:cs="Courier New"/>
+                <w:b w:val="0"/>
+                <w:bCs w:val="0"/>
+              </w:rPr>
+              <w:t xml:space="preserve"> 12345</w:t>
             </w:r>
             <w:r>
               <w:rPr>
@@ -1666,8 +2110,43 @@
                 <w:b w:val="0"/>
                 <w:bCs w:val="0"/>
               </w:rPr>
-              <w:lastRenderedPageBreak/>
-              <w:t>-db computing.txt -sid 12345</w:t>
+              <w:t>-</w:t>
+            </w:r>
+            <w:proofErr w:type="spellStart"/>
+            <w:r>
+              <w:rPr>
+                <w:rFonts w:ascii="Courier New" w:hAnsi="Courier New" w:cs="Courier New"/>
+                <w:b w:val="0"/>
+                <w:bCs w:val="0"/>
+              </w:rPr>
+              <w:t>db</w:t>
+            </w:r>
+            <w:proofErr w:type="spellEnd"/>
+            <w:r>
+              <w:rPr>
+                <w:rFonts w:ascii="Courier New" w:hAnsi="Courier New" w:cs="Courier New"/>
+                <w:b w:val="0"/>
+                <w:bCs w:val="0"/>
+              </w:rPr>
+              <w:t xml:space="preserve"> computing.txt -</w:t>
+            </w:r>
+            <w:proofErr w:type="spellStart"/>
+            <w:r>
+              <w:rPr>
+                <w:rFonts w:ascii="Courier New" w:hAnsi="Courier New" w:cs="Courier New"/>
+                <w:b w:val="0"/>
+                <w:bCs w:val="0"/>
+              </w:rPr>
+              <w:t>sid</w:t>
+            </w:r>
+            <w:proofErr w:type="spellEnd"/>
+            <w:r>
+              <w:rPr>
+                <w:rFonts w:ascii="Courier New" w:hAnsi="Courier New" w:cs="Courier New"/>
+                <w:b w:val="0"/>
+                <w:bCs w:val="0"/>
+              </w:rPr>
+              <w:t xml:space="preserve"> 12345</w:t>
             </w:r>
             <w:r>
               <w:rPr>
@@ -1724,7 +2203,43 @@
                 <w:b w:val="0"/>
                 <w:bCs w:val="0"/>
               </w:rPr>
-              <w:t>-db computing.txt -sid 12345</w:t>
+              <w:t>-</w:t>
+            </w:r>
+            <w:proofErr w:type="spellStart"/>
+            <w:r>
+              <w:rPr>
+                <w:rFonts w:ascii="Courier New" w:hAnsi="Courier New" w:cs="Courier New"/>
+                <w:b w:val="0"/>
+                <w:bCs w:val="0"/>
+              </w:rPr>
+              <w:t>db</w:t>
+            </w:r>
+            <w:proofErr w:type="spellEnd"/>
+            <w:r>
+              <w:rPr>
+                <w:rFonts w:ascii="Courier New" w:hAnsi="Courier New" w:cs="Courier New"/>
+                <w:b w:val="0"/>
+                <w:bCs w:val="0"/>
+              </w:rPr>
+              <w:t xml:space="preserve"> computing.txt -</w:t>
+            </w:r>
+            <w:proofErr w:type="spellStart"/>
+            <w:r>
+              <w:rPr>
+                <w:rFonts w:ascii="Courier New" w:hAnsi="Courier New" w:cs="Courier New"/>
+                <w:b w:val="0"/>
+                <w:bCs w:val="0"/>
+              </w:rPr>
+              <w:t>sid</w:t>
+            </w:r>
+            <w:proofErr w:type="spellEnd"/>
+            <w:r>
+              <w:rPr>
+                <w:rFonts w:ascii="Courier New" w:hAnsi="Courier New" w:cs="Courier New"/>
+                <w:b w:val="0"/>
+                <w:bCs w:val="0"/>
+              </w:rPr>
+              <w:t xml:space="preserve"> 12345</w:t>
             </w:r>
             <w:r>
               <w:rPr>
@@ -1781,15 +2296,43 @@
                 <w:b w:val="0"/>
                 <w:bCs w:val="0"/>
               </w:rPr>
-              <w:t>-db computing.txt -</w:t>
-            </w:r>
-            <w:r>
-              <w:rPr>
-                <w:rFonts w:ascii="Courier New" w:hAnsi="Courier New" w:cs="Courier New"/>
-                <w:b w:val="0"/>
-                <w:bCs w:val="0"/>
-              </w:rPr>
-              <w:t>sid 14351</w:t>
+              <w:t>-</w:t>
+            </w:r>
+            <w:proofErr w:type="spellStart"/>
+            <w:r>
+              <w:rPr>
+                <w:rFonts w:ascii="Courier New" w:hAnsi="Courier New" w:cs="Courier New"/>
+                <w:b w:val="0"/>
+                <w:bCs w:val="0"/>
+              </w:rPr>
+              <w:t>db</w:t>
+            </w:r>
+            <w:proofErr w:type="spellEnd"/>
+            <w:r>
+              <w:rPr>
+                <w:rFonts w:ascii="Courier New" w:hAnsi="Courier New" w:cs="Courier New"/>
+                <w:b w:val="0"/>
+                <w:bCs w:val="0"/>
+              </w:rPr>
+              <w:t xml:space="preserve"> computing.txt -</w:t>
+            </w:r>
+            <w:proofErr w:type="spellStart"/>
+            <w:r>
+              <w:rPr>
+                <w:rFonts w:ascii="Courier New" w:hAnsi="Courier New" w:cs="Courier New"/>
+                <w:b w:val="0"/>
+                <w:bCs w:val="0"/>
+              </w:rPr>
+              <w:t>sid</w:t>
+            </w:r>
+            <w:proofErr w:type="spellEnd"/>
+            <w:r>
+              <w:rPr>
+                <w:rFonts w:ascii="Courier New" w:hAnsi="Courier New" w:cs="Courier New"/>
+                <w:b w:val="0"/>
+                <w:bCs w:val="0"/>
+              </w:rPr>
+              <w:t xml:space="preserve"> 14351</w:t>
             </w:r>
             <w:r>
               <w:rPr>
@@ -1908,8 +2451,8 @@
         <w:tblLook w:val="04A0" w:firstRow="1" w:lastRow="0" w:firstColumn="1" w:lastColumn="0" w:noHBand="0" w:noVBand="1"/>
       </w:tblPr>
       <w:tblGrid>
-        <w:gridCol w:w="5524"/>
-        <w:gridCol w:w="8079"/>
+        <w:gridCol w:w="7792"/>
+        <w:gridCol w:w="5811"/>
         <w:gridCol w:w="993"/>
       </w:tblGrid>
       <w:tr>
@@ -1919,7 +2462,7 @@
         <w:tc>
           <w:tcPr>
             <w:cnfStyle w:val="001000000000" w:firstRow="0" w:lastRow="0" w:firstColumn="1" w:lastColumn="0" w:oddVBand="0" w:evenVBand="0" w:oddHBand="0" w:evenHBand="0" w:firstRowFirstColumn="0" w:firstRowLastColumn="0" w:lastRowFirstColumn="0" w:lastRowLastColumn="0"/>
-            <w:tcW w:w="5524" w:type="dxa"/>
+            <w:tcW w:w="7792" w:type="dxa"/>
           </w:tcPr>
           <w:p>
             <w:r>
@@ -1929,7 +2472,7 @@
         </w:tc>
         <w:tc>
           <w:tcPr>
-            <w:tcW w:w="8079" w:type="dxa"/>
+            <w:tcW w:w="5811" w:type="dxa"/>
           </w:tcPr>
           <w:p>
             <w:pPr>
@@ -1958,7 +2501,7 @@
         <w:tc>
           <w:tcPr>
             <w:cnfStyle w:val="001000000000" w:firstRow="0" w:lastRow="0" w:firstColumn="1" w:lastColumn="0" w:oddVBand="0" w:evenVBand="0" w:oddHBand="0" w:evenHBand="0" w:firstRowFirstColumn="0" w:firstRowLastColumn="0" w:lastRowFirstColumn="0" w:lastRowLastColumn="0"/>
-            <w:tcW w:w="5524" w:type="dxa"/>
+            <w:tcW w:w="7792" w:type="dxa"/>
           </w:tcPr>
           <w:p>
             <w:pPr>
@@ -1989,20 +2532,26 @@
               </w:rPr>
               <w:t xml:space="preserve"> if present</w:t>
             </w:r>
-          </w:p>
-          <w:p>
-            <w:r>
-              <w:rPr>
-                <w:b w:val="0"/>
-                <w:bCs w:val="0"/>
-              </w:rPr>
-              <w:t xml:space="preserve">Run </w:t>
-            </w:r>
-            <w:r>
-              <w:rPr>
-                <w:rFonts w:ascii="Courier New" w:hAnsi="Courier New" w:cs="Courier New"/>
-                <w:b w:val="0"/>
-                <w:bCs w:val="0"/>
+            <w:r>
+              <w:rPr>
+                <w:b w:val="0"/>
+                <w:bCs w:val="0"/>
+              </w:rPr>
+              <w:t xml:space="preserve">, then run </w:t>
+            </w:r>
+            <w:r>
+              <w:rPr>
+                <w:b w:val="0"/>
+                <w:bCs w:val="0"/>
+              </w:rPr>
+              <w:br/>
+            </w:r>
+            <w:r>
+              <w:rPr>
+                <w:rFonts w:ascii="Courier New" w:hAnsi="Courier New" w:cs="Courier New"/>
+                <w:b w:val="0"/>
+                <w:bCs w:val="0"/>
+                <w:color w:val="70AD47" w:themeColor="accent6"/>
               </w:rPr>
               <w:t>addrecord.exe</w:t>
             </w:r>
@@ -2010,37 +2559,73 @@
               <w:rPr>
                 <w:b w:val="0"/>
                 <w:bCs w:val="0"/>
-              </w:rPr>
-              <w:t xml:space="preserve"> with</w:t>
-            </w:r>
-            <w:r>
-              <w:rPr>
-                <w:b w:val="0"/>
-                <w:bCs w:val="0"/>
-              </w:rPr>
-              <w:t xml:space="preserve"> the following parameters:</w:t>
-            </w:r>
-          </w:p>
-          <w:p>
-            <w:pPr>
-              <w:rPr>
-                <w:b w:val="0"/>
-                <w:bCs w:val="0"/>
-              </w:rPr>
-            </w:pPr>
-            <w:r>
-              <w:rPr>
-                <w:rFonts w:ascii="Courier New" w:hAnsi="Courier New" w:cs="Courier New"/>
-                <w:b w:val="0"/>
-                <w:bCs w:val="0"/>
-              </w:rPr>
-              <w:t>-db computing.txt -showAll</w:t>
-            </w:r>
-          </w:p>
-        </w:tc>
-        <w:tc>
-          <w:tcPr>
-            <w:tcW w:w="8079" w:type="dxa"/>
+                <w:color w:val="70AD47" w:themeColor="accent6"/>
+              </w:rPr>
+              <w:t xml:space="preserve"> </w:t>
+            </w:r>
+            <w:r>
+              <w:rPr>
+                <w:rFonts w:ascii="Courier New" w:hAnsi="Courier New" w:cs="Courier New"/>
+                <w:b w:val="0"/>
+                <w:bCs w:val="0"/>
+                <w:color w:val="70AD47" w:themeColor="accent6"/>
+              </w:rPr>
+              <w:t>-</w:t>
+            </w:r>
+            <w:proofErr w:type="spellStart"/>
+            <w:r>
+              <w:rPr>
+                <w:rFonts w:ascii="Courier New" w:hAnsi="Courier New" w:cs="Courier New"/>
+                <w:b w:val="0"/>
+                <w:bCs w:val="0"/>
+                <w:color w:val="70AD47" w:themeColor="accent6"/>
+              </w:rPr>
+              <w:t>db</w:t>
+            </w:r>
+            <w:proofErr w:type="spellEnd"/>
+            <w:r>
+              <w:rPr>
+                <w:rFonts w:ascii="Courier New" w:hAnsi="Courier New" w:cs="Courier New"/>
+                <w:b w:val="0"/>
+                <w:bCs w:val="0"/>
+                <w:color w:val="70AD47" w:themeColor="accent6"/>
+              </w:rPr>
+              <w:t xml:space="preserve"> computing.txt </w:t>
+            </w:r>
+            <w:r>
+              <w:rPr>
+                <w:rFonts w:ascii="Courier New" w:hAnsi="Courier New" w:cs="Courier New"/>
+                <w:b w:val="0"/>
+                <w:bCs w:val="0"/>
+                <w:color w:val="70AD47" w:themeColor="accent6"/>
+              </w:rPr>
+              <w:t>-</w:t>
+            </w:r>
+            <w:proofErr w:type="spellStart"/>
+            <w:r>
+              <w:rPr>
+                <w:rFonts w:ascii="Courier New" w:hAnsi="Courier New" w:cs="Courier New"/>
+                <w:b w:val="0"/>
+                <w:bCs w:val="0"/>
+                <w:color w:val="70AD47" w:themeColor="accent6"/>
+              </w:rPr>
+              <w:t>sid</w:t>
+            </w:r>
+            <w:proofErr w:type="spellEnd"/>
+            <w:r>
+              <w:rPr>
+                <w:rFonts w:ascii="Courier New" w:hAnsi="Courier New" w:cs="Courier New"/>
+                <w:b w:val="0"/>
+                <w:bCs w:val="0"/>
+                <w:color w:val="70AD47" w:themeColor="accent6"/>
+              </w:rPr>
+              <w:t xml:space="preserve"> 12345 -name Sam Smith</w:t>
+            </w:r>
+          </w:p>
+        </w:tc>
+        <w:tc>
+          <w:tcPr>
+            <w:tcW w:w="5811" w:type="dxa"/>
           </w:tcPr>
           <w:p>
             <w:pPr>
@@ -2077,7 +2662,7 @@
         <w:tc>
           <w:tcPr>
             <w:cnfStyle w:val="001000000000" w:firstRow="0" w:lastRow="0" w:firstColumn="1" w:lastColumn="0" w:oddVBand="0" w:evenVBand="0" w:oddHBand="0" w:evenHBand="0" w:firstRowFirstColumn="0" w:firstRowLastColumn="0" w:lastRowFirstColumn="0" w:lastRowLastColumn="0"/>
-            <w:tcW w:w="5524" w:type="dxa"/>
+            <w:tcW w:w="7792" w:type="dxa"/>
           </w:tcPr>
           <w:p>
             <w:r>
@@ -2099,7 +2684,7 @@
         </w:tc>
         <w:tc>
           <w:tcPr>
-            <w:tcW w:w="8079" w:type="dxa"/>
+            <w:tcW w:w="5811" w:type="dxa"/>
           </w:tcPr>
           <w:p>
             <w:pPr>
@@ -2128,20 +2713,20 @@
         <w:tc>
           <w:tcPr>
             <w:cnfStyle w:val="001000000000" w:firstRow="0" w:lastRow="0" w:firstColumn="1" w:lastColumn="0" w:oddVBand="0" w:evenVBand="0" w:oddHBand="0" w:evenHBand="0" w:firstRowFirstColumn="0" w:firstRowLastColumn="0" w:lastRowFirstColumn="0" w:lastRowLastColumn="0"/>
-            <w:tcW w:w="5524" w:type="dxa"/>
-          </w:tcPr>
-          <w:p>
-            <w:pPr>
-              <w:rPr>
-                <w:b w:val="0"/>
-                <w:bCs w:val="0"/>
-              </w:rPr>
-            </w:pPr>
-          </w:p>
-        </w:tc>
-        <w:tc>
-          <w:tcPr>
-            <w:tcW w:w="8079" w:type="dxa"/>
+            <w:tcW w:w="7792" w:type="dxa"/>
+          </w:tcPr>
+          <w:p>
+            <w:pPr>
+              <w:rPr>
+                <w:b w:val="0"/>
+                <w:bCs w:val="0"/>
+              </w:rPr>
+            </w:pPr>
+          </w:p>
+        </w:tc>
+        <w:tc>
+          <w:tcPr>
+            <w:tcW w:w="5811" w:type="dxa"/>
           </w:tcPr>
           <w:p>
             <w:pPr>
@@ -2164,20 +2749,20 @@
         <w:tc>
           <w:tcPr>
             <w:cnfStyle w:val="001000000000" w:firstRow="0" w:lastRow="0" w:firstColumn="1" w:lastColumn="0" w:oddVBand="0" w:evenVBand="0" w:oddHBand="0" w:evenHBand="0" w:firstRowFirstColumn="0" w:firstRowLastColumn="0" w:lastRowFirstColumn="0" w:lastRowLastColumn="0"/>
-            <w:tcW w:w="5524" w:type="dxa"/>
-          </w:tcPr>
-          <w:p>
-            <w:pPr>
-              <w:rPr>
-                <w:b w:val="0"/>
-                <w:bCs w:val="0"/>
-              </w:rPr>
-            </w:pPr>
-          </w:p>
-        </w:tc>
-        <w:tc>
-          <w:tcPr>
-            <w:tcW w:w="8079" w:type="dxa"/>
+            <w:tcW w:w="7792" w:type="dxa"/>
+          </w:tcPr>
+          <w:p>
+            <w:pPr>
+              <w:rPr>
+                <w:b w:val="0"/>
+                <w:bCs w:val="0"/>
+              </w:rPr>
+            </w:pPr>
+          </w:p>
+        </w:tc>
+        <w:tc>
+          <w:tcPr>
+            <w:tcW w:w="5811" w:type="dxa"/>
           </w:tcPr>
           <w:p>
             <w:pPr>
@@ -2235,8 +2820,8 @@
         <w:tblLook w:val="04A0" w:firstRow="1" w:lastRow="0" w:firstColumn="1" w:lastColumn="0" w:noHBand="0" w:noVBand="1"/>
       </w:tblPr>
       <w:tblGrid>
-        <w:gridCol w:w="5524"/>
-        <w:gridCol w:w="8079"/>
+        <w:gridCol w:w="6941"/>
+        <w:gridCol w:w="6662"/>
         <w:gridCol w:w="993"/>
       </w:tblGrid>
       <w:tr>
@@ -2246,7 +2831,7 @@
         <w:tc>
           <w:tcPr>
             <w:cnfStyle w:val="001000000000" w:firstRow="0" w:lastRow="0" w:firstColumn="1" w:lastColumn="0" w:oddVBand="0" w:evenVBand="0" w:oddHBand="0" w:evenHBand="0" w:firstRowFirstColumn="0" w:firstRowLastColumn="0" w:lastRowFirstColumn="0" w:lastRowLastColumn="0"/>
-            <w:tcW w:w="5524" w:type="dxa"/>
+            <w:tcW w:w="6941" w:type="dxa"/>
           </w:tcPr>
           <w:p>
             <w:r>
@@ -2256,7 +2841,7 @@
         </w:tc>
         <w:tc>
           <w:tcPr>
-            <w:tcW w:w="8079" w:type="dxa"/>
+            <w:tcW w:w="6662" w:type="dxa"/>
           </w:tcPr>
           <w:p>
             <w:pPr>
@@ -2285,15 +2870,9 @@
         <w:tc>
           <w:tcPr>
             <w:cnfStyle w:val="001000000000" w:firstRow="0" w:lastRow="0" w:firstColumn="1" w:lastColumn="0" w:oddVBand="0" w:evenVBand="0" w:oddHBand="0" w:evenHBand="0" w:firstRowFirstColumn="0" w:firstRowLastColumn="0" w:lastRowFirstColumn="0" w:lastRowLastColumn="0"/>
-            <w:tcW w:w="5524" w:type="dxa"/>
-          </w:tcPr>
-          <w:p>
-            <w:pPr>
-              <w:rPr>
-                <w:b w:val="0"/>
-                <w:bCs w:val="0"/>
-              </w:rPr>
-            </w:pPr>
+            <w:tcW w:w="6941" w:type="dxa"/>
+          </w:tcPr>
+          <w:p>
             <w:r>
               <w:rPr>
                 <w:b w:val="0"/>
@@ -2316,65 +2895,109 @@
               </w:rPr>
               <w:t xml:space="preserve"> if present</w:t>
             </w:r>
-          </w:p>
-          <w:p>
-            <w:r>
-              <w:rPr>
-                <w:b w:val="0"/>
-                <w:bCs w:val="0"/>
-              </w:rPr>
-              <w:t xml:space="preserve">Run </w:t>
-            </w:r>
-            <w:r>
-              <w:rPr>
-                <w:b w:val="0"/>
-                <w:bCs w:val="0"/>
-              </w:rPr>
-              <w:t>update</w:t>
-            </w:r>
-            <w:r>
-              <w:rPr>
-                <w:rFonts w:ascii="Courier New" w:hAnsi="Courier New" w:cs="Courier New"/>
-                <w:b w:val="0"/>
-                <w:bCs w:val="0"/>
-              </w:rPr>
-              <w:t>record.exe</w:t>
-            </w:r>
-            <w:r>
-              <w:rPr>
-                <w:b w:val="0"/>
-                <w:bCs w:val="0"/>
-              </w:rPr>
-              <w:t xml:space="preserve"> with</w:t>
-            </w:r>
-            <w:r>
-              <w:rPr>
-                <w:b w:val="0"/>
-                <w:bCs w:val="0"/>
-              </w:rPr>
-              <w:t xml:space="preserve"> the following parameters:</w:t>
-            </w:r>
-          </w:p>
-          <w:p>
-            <w:pPr>
-              <w:rPr>
-                <w:b w:val="0"/>
-                <w:bCs w:val="0"/>
-              </w:rPr>
-            </w:pPr>
-            <w:r>
-              <w:rPr>
-                <w:rFonts w:ascii="Courier New" w:hAnsi="Courier New" w:cs="Courier New"/>
-                <w:b w:val="0"/>
-                <w:bCs w:val="0"/>
-              </w:rPr>
-              <w:t>-db computing.txt -showAll</w:t>
-            </w:r>
-          </w:p>
-        </w:tc>
-        <w:tc>
-          <w:tcPr>
-            <w:tcW w:w="8079" w:type="dxa"/>
+            <w:r>
+              <w:rPr>
+                <w:b w:val="0"/>
+                <w:bCs w:val="0"/>
+              </w:rPr>
+              <w:t xml:space="preserve">, then </w:t>
+            </w:r>
+            <w:proofErr w:type="gramStart"/>
+            <w:r>
+              <w:rPr>
+                <w:b w:val="0"/>
+                <w:bCs w:val="0"/>
+              </w:rPr>
+              <w:t>run</w:t>
+            </w:r>
+            <w:proofErr w:type="gramEnd"/>
+            <w:r>
+              <w:rPr>
+                <w:b w:val="0"/>
+                <w:bCs w:val="0"/>
+              </w:rPr>
+              <w:t xml:space="preserve"> </w:t>
+            </w:r>
+          </w:p>
+          <w:p>
+            <w:pPr>
+              <w:rPr>
+                <w:rFonts w:ascii="Courier New" w:hAnsi="Courier New" w:cs="Courier New"/>
+                <w:b w:val="0"/>
+                <w:bCs w:val="0"/>
+              </w:rPr>
+            </w:pPr>
+            <w:proofErr w:type="spellStart"/>
+            <w:r>
+              <w:rPr>
+                <w:rFonts w:ascii="Courier New" w:hAnsi="Courier New" w:cs="Courier New"/>
+                <w:color w:val="008000"/>
+                <w:kern w:val="0"/>
+                <w:sz w:val="19"/>
+                <w:szCs w:val="19"/>
+              </w:rPr>
+              <w:t>updaterecord</w:t>
+            </w:r>
+            <w:proofErr w:type="spellEnd"/>
+            <w:r>
+              <w:rPr>
+                <w:rFonts w:ascii="Courier New" w:hAnsi="Courier New" w:cs="Courier New"/>
+                <w:color w:val="008000"/>
+                <w:kern w:val="0"/>
+                <w:sz w:val="19"/>
+                <w:szCs w:val="19"/>
+              </w:rPr>
+              <w:t xml:space="preserve"> -</w:t>
+            </w:r>
+            <w:proofErr w:type="spellStart"/>
+            <w:r>
+              <w:rPr>
+                <w:rFonts w:ascii="Courier New" w:hAnsi="Courier New" w:cs="Courier New"/>
+                <w:color w:val="008000"/>
+                <w:kern w:val="0"/>
+                <w:sz w:val="19"/>
+                <w:szCs w:val="19"/>
+              </w:rPr>
+              <w:t>db</w:t>
+            </w:r>
+            <w:proofErr w:type="spellEnd"/>
+            <w:r>
+              <w:rPr>
+                <w:rFonts w:ascii="Courier New" w:hAnsi="Courier New" w:cs="Courier New"/>
+                <w:color w:val="008000"/>
+                <w:kern w:val="0"/>
+                <w:sz w:val="19"/>
+                <w:szCs w:val="19"/>
+              </w:rPr>
+              <w:t xml:space="preserve"> computing.txt -</w:t>
+            </w:r>
+            <w:proofErr w:type="spellStart"/>
+            <w:r>
+              <w:rPr>
+                <w:rFonts w:ascii="Courier New" w:hAnsi="Courier New" w:cs="Courier New"/>
+                <w:color w:val="008000"/>
+                <w:kern w:val="0"/>
+                <w:sz w:val="19"/>
+                <w:szCs w:val="19"/>
+              </w:rPr>
+              <w:t>sid</w:t>
+            </w:r>
+            <w:proofErr w:type="spellEnd"/>
+            <w:r>
+              <w:rPr>
+                <w:rFonts w:ascii="Courier New" w:hAnsi="Courier New" w:cs="Courier New"/>
+                <w:color w:val="008000"/>
+                <w:kern w:val="0"/>
+                <w:sz w:val="19"/>
+                <w:szCs w:val="19"/>
+              </w:rPr>
+              <w:t xml:space="preserve"> 12345 –name Les Paul</w:t>
+            </w:r>
+          </w:p>
+        </w:tc>
+        <w:tc>
+          <w:tcPr>
+            <w:tcW w:w="6662" w:type="dxa"/>
           </w:tcPr>
           <w:p>
             <w:pPr>
@@ -2389,7 +3012,13 @@
               <w:cnfStyle w:val="000000000000" w:firstRow="0" w:lastRow="0" w:firstColumn="0" w:lastColumn="0" w:oddVBand="0" w:evenVBand="0" w:oddHBand="0" w:evenHBand="0" w:firstRowFirstColumn="0" w:firstRowLastColumn="0" w:lastRowFirstColumn="0" w:lastRowLastColumn="0"/>
             </w:pPr>
             <w:r>
-              <w:t>Cannot open file computing.txt</w:t>
+              <w:t>Cannot open</w:t>
+            </w:r>
+            <w:r>
+              <w:t xml:space="preserve"> database</w:t>
+            </w:r>
+            <w:r>
+              <w:t xml:space="preserve"> file computing.txt</w:t>
             </w:r>
           </w:p>
         </w:tc>
@@ -2411,7 +3040,7 @@
         <w:tc>
           <w:tcPr>
             <w:cnfStyle w:val="001000000000" w:firstRow="0" w:lastRow="0" w:firstColumn="1" w:lastColumn="0" w:oddVBand="0" w:evenVBand="0" w:oddHBand="0" w:evenHBand="0" w:firstRowFirstColumn="0" w:firstRowLastColumn="0" w:lastRowFirstColumn="0" w:lastRowLastColumn="0"/>
-            <w:tcW w:w="5524" w:type="dxa"/>
+            <w:tcW w:w="6941" w:type="dxa"/>
           </w:tcPr>
           <w:p>
             <w:r>
@@ -2454,7 +3083,7 @@
         </w:tc>
         <w:tc>
           <w:tcPr>
-            <w:tcW w:w="8079" w:type="dxa"/>
+            <w:tcW w:w="6662" w:type="dxa"/>
           </w:tcPr>
           <w:p>
             <w:pPr>
@@ -2483,20 +3112,20 @@
         <w:tc>
           <w:tcPr>
             <w:cnfStyle w:val="001000000000" w:firstRow="0" w:lastRow="0" w:firstColumn="1" w:lastColumn="0" w:oddVBand="0" w:evenVBand="0" w:oddHBand="0" w:evenHBand="0" w:firstRowFirstColumn="0" w:firstRowLastColumn="0" w:lastRowFirstColumn="0" w:lastRowLastColumn="0"/>
-            <w:tcW w:w="5524" w:type="dxa"/>
-          </w:tcPr>
-          <w:p>
-            <w:pPr>
-              <w:rPr>
-                <w:b w:val="0"/>
-                <w:bCs w:val="0"/>
-              </w:rPr>
-            </w:pPr>
-          </w:p>
-        </w:tc>
-        <w:tc>
-          <w:tcPr>
-            <w:tcW w:w="8079" w:type="dxa"/>
+            <w:tcW w:w="6941" w:type="dxa"/>
+          </w:tcPr>
+          <w:p>
+            <w:pPr>
+              <w:rPr>
+                <w:b w:val="0"/>
+                <w:bCs w:val="0"/>
+              </w:rPr>
+            </w:pPr>
+          </w:p>
+        </w:tc>
+        <w:tc>
+          <w:tcPr>
+            <w:tcW w:w="6662" w:type="dxa"/>
           </w:tcPr>
           <w:p>
             <w:pPr>
@@ -2519,20 +3148,20 @@
         <w:tc>
           <w:tcPr>
             <w:cnfStyle w:val="001000000000" w:firstRow="0" w:lastRow="0" w:firstColumn="1" w:lastColumn="0" w:oddVBand="0" w:evenVBand="0" w:oddHBand="0" w:evenHBand="0" w:firstRowFirstColumn="0" w:firstRowLastColumn="0" w:lastRowFirstColumn="0" w:lastRowLastColumn="0"/>
-            <w:tcW w:w="5524" w:type="dxa"/>
-          </w:tcPr>
-          <w:p>
-            <w:pPr>
-              <w:rPr>
-                <w:b w:val="0"/>
-                <w:bCs w:val="0"/>
-              </w:rPr>
-            </w:pPr>
-          </w:p>
-        </w:tc>
-        <w:tc>
-          <w:tcPr>
-            <w:tcW w:w="8079" w:type="dxa"/>
+            <w:tcW w:w="6941" w:type="dxa"/>
+          </w:tcPr>
+          <w:p>
+            <w:pPr>
+              <w:rPr>
+                <w:b w:val="0"/>
+                <w:bCs w:val="0"/>
+              </w:rPr>
+            </w:pPr>
+          </w:p>
+        </w:tc>
+        <w:tc>
+          <w:tcPr>
+            <w:tcW w:w="6662" w:type="dxa"/>
           </w:tcPr>
           <w:p>
             <w:pPr>
@@ -2667,7 +3296,15 @@
               <w:cnfStyle w:val="000000000000" w:firstRow="0" w:lastRow="0" w:firstColumn="0" w:lastColumn="0" w:oddVBand="0" w:evenVBand="0" w:oddHBand="0" w:evenHBand="0" w:firstRowFirstColumn="0" w:firstRowLastColumn="0" w:lastRowFirstColumn="0" w:lastRowLastColumn="0"/>
             </w:pPr>
             <w:r>
-              <w:t xml:space="preserve">No records displayed </w:t>
+              <w:t xml:space="preserve">No records </w:t>
+            </w:r>
+            <w:proofErr w:type="gramStart"/>
+            <w:r>
+              <w:t>displayed</w:t>
+            </w:r>
+            <w:proofErr w:type="gramEnd"/>
+            <w:r>
+              <w:t xml:space="preserve"> </w:t>
             </w:r>
           </w:p>
           <w:p>
@@ -2773,7 +3410,15 @@
               <w:cnfStyle w:val="000000000000" w:firstRow="0" w:lastRow="0" w:firstColumn="0" w:lastColumn="0" w:oddVBand="0" w:evenVBand="0" w:oddHBand="0" w:evenHBand="0" w:firstRowFirstColumn="0" w:firstRowLastColumn="0" w:lastRowFirstColumn="0" w:lastRowLastColumn="0"/>
             </w:pPr>
             <w:r>
-              <w:t xml:space="preserve">No records displayed </w:t>
+              <w:t xml:space="preserve">No records </w:t>
+            </w:r>
+            <w:proofErr w:type="gramStart"/>
+            <w:r>
+              <w:t>displayed</w:t>
+            </w:r>
+            <w:proofErr w:type="gramEnd"/>
+            <w:r>
+              <w:t xml:space="preserve"> </w:t>
             </w:r>
           </w:p>
           <w:p>
@@ -3270,6 +3915,7 @@
     </w:tbl>
     <w:p/>
     <w:sectPr>
+      <w:footerReference w:type="default" r:id="rId7"/>
       <w:pgSz w:w="16838" w:h="11906" w:orient="landscape"/>
       <w:pgMar w:top="1440" w:right="1440" w:bottom="1440" w:left="1440" w:header="708" w:footer="708" w:gutter="0"/>
       <w:cols w:space="708"/>
@@ -3277,6 +3923,306 @@
     </w:sectPr>
   </w:body>
 </w:document>
+</file>
+
+<file path=word/endnotes.xml><?xml version="1.0" encoding="utf-8"?>
+<w:endnotes xmlns:wpc="http://schemas.microsoft.com/office/word/2010/wordprocessingCanvas" xmlns:cx="http://schemas.microsoft.com/office/drawing/2014/chartex" xmlns:cx1="http://schemas.microsoft.com/office/drawing/2015/9/8/chartex" xmlns:cx2="http://schemas.microsoft.com/office/drawing/2015/10/21/chartex" xmlns:cx3="http://schemas.microsoft.com/office/drawing/2016/5/9/chartex" xmlns:cx4="http://schemas.microsoft.com/office/drawing/2016/5/10/chartex" xmlns:cx5="http://schemas.microsoft.com/office/drawing/2016/5/11/chartex" xmlns:cx6="http://schemas.microsoft.com/office/drawing/2016/5/12/chartex" xmlns:cx7="http://schemas.microsoft.com/office/drawing/2016/5/13/chartex" xmlns:cx8="http://schemas.microsoft.com/office/drawing/2016/5/14/chartex" xmlns:mc="http://schemas.openxmlformats.org/markup-compatibility/2006" xmlns:aink="http://schemas.microsoft.com/office/drawing/2016/ink" xmlns:am3d="http://schemas.microsoft.com/office/drawing/2017/model3d" xmlns:o="urn:schemas-microsoft-com:office:office" xmlns:oel="http://schemas.microsoft.com/office/2019/extlst" xmlns:r="http://schemas.openxmlformats.org/officeDocument/2006/relationships" xmlns:m="http://schemas.openxmlformats.org/officeDocument/2006/math" xmlns:v="urn:schemas-microsoft-com:vml" xmlns:wp14="http://schemas.microsoft.com/office/word/2010/wordprocessingDrawing" xmlns:wp="http://schemas.openxmlformats.org/drawingml/2006/wordprocessingDrawing" xmlns:w10="urn:schemas-microsoft-com:office:word" xmlns:w="http://schemas.openxmlformats.org/wordprocessingml/2006/main" xmlns:w14="http://schemas.microsoft.com/office/word/2010/wordml" xmlns:w15="http://schemas.microsoft.com/office/word/2012/wordml" xmlns:w16cex="http://schemas.microsoft.com/office/word/2018/wordml/cex" xmlns:w16cid="http://schemas.microsoft.com/office/word/2016/wordml/cid" xmlns:w16="http://schemas.microsoft.com/office/word/2018/wordml" xmlns:w16sdtdh="http://schemas.microsoft.com/office/word/2020/wordml/sdtdatahash" xmlns:w16se="http://schemas.microsoft.com/office/word/2015/wordml/symex" xmlns:wpg="http://schemas.microsoft.com/office/word/2010/wordprocessingGroup" xmlns:wpi="http://schemas.microsoft.com/office/word/2010/wordprocessingInk" xmlns:wne="http://schemas.microsoft.com/office/word/2006/wordml" xmlns:wps="http://schemas.microsoft.com/office/word/2010/wordprocessingShape" mc:Ignorable="w14 w15 w16se w16cid w16 w16cex w16sdtdh wp14">
+  <w:endnote w:type="separator" w:id="-1">
+    <w:p>
+      <w:pPr>
+        <w:spacing w:after="0" w:line="240" w:lineRule="auto"/>
+      </w:pPr>
+      <w:r>
+        <w:separator/>
+      </w:r>
+    </w:p>
+  </w:endnote>
+  <w:endnote w:type="continuationSeparator" w:id="0">
+    <w:p>
+      <w:pPr>
+        <w:spacing w:after="0" w:line="240" w:lineRule="auto"/>
+      </w:pPr>
+      <w:r>
+        <w:continuationSeparator/>
+      </w:r>
+    </w:p>
+  </w:endnote>
+</w:endnotes>
+</file>
+
+<file path=word/footer1.xml><?xml version="1.0" encoding="utf-8"?>
+<w:ftr xmlns:wpc="http://schemas.microsoft.com/office/word/2010/wordprocessingCanvas" xmlns:cx="http://schemas.microsoft.com/office/drawing/2014/chartex" xmlns:cx1="http://schemas.microsoft.com/office/drawing/2015/9/8/chartex" xmlns:cx2="http://schemas.microsoft.com/office/drawing/2015/10/21/chartex" xmlns:cx3="http://schemas.microsoft.com/office/drawing/2016/5/9/chartex" xmlns:cx4="http://schemas.microsoft.com/office/drawing/2016/5/10/chartex" xmlns:cx5="http://schemas.microsoft.com/office/drawing/2016/5/11/chartex" xmlns:cx6="http://schemas.microsoft.com/office/drawing/2016/5/12/chartex" xmlns:cx7="http://schemas.microsoft.com/office/drawing/2016/5/13/chartex" xmlns:cx8="http://schemas.microsoft.com/office/drawing/2016/5/14/chartex" xmlns:mc="http://schemas.openxmlformats.org/markup-compatibility/2006" xmlns:aink="http://schemas.microsoft.com/office/drawing/2016/ink" xmlns:am3d="http://schemas.microsoft.com/office/drawing/2017/model3d" xmlns:o="urn:schemas-microsoft-com:office:office" xmlns:oel="http://schemas.microsoft.com/office/2019/extlst" xmlns:r="http://schemas.openxmlformats.org/officeDocument/2006/relationships" xmlns:m="http://schemas.openxmlformats.org/officeDocument/2006/math" xmlns:v="urn:schemas-microsoft-com:vml" xmlns:wp14="http://schemas.microsoft.com/office/word/2010/wordprocessingDrawing" xmlns:wp="http://schemas.openxmlformats.org/drawingml/2006/wordprocessingDrawing" xmlns:w10="urn:schemas-microsoft-com:office:word" xmlns:w="http://schemas.openxmlformats.org/wordprocessingml/2006/main" xmlns:w14="http://schemas.microsoft.com/office/word/2010/wordml" xmlns:w15="http://schemas.microsoft.com/office/word/2012/wordml" xmlns:w16cex="http://schemas.microsoft.com/office/word/2018/wordml/cex" xmlns:w16cid="http://schemas.microsoft.com/office/word/2016/wordml/cid" xmlns:w16="http://schemas.microsoft.com/office/word/2018/wordml" xmlns:w16sdtdh="http://schemas.microsoft.com/office/word/2020/wordml/sdtdatahash" xmlns:w16se="http://schemas.microsoft.com/office/word/2015/wordml/symex" xmlns:wpg="http://schemas.microsoft.com/office/word/2010/wordprocessingGroup" xmlns:wpi="http://schemas.microsoft.com/office/word/2010/wordprocessingInk" xmlns:wne="http://schemas.microsoft.com/office/word/2006/wordml" xmlns:wps="http://schemas.microsoft.com/office/word/2010/wordprocessingShape" mc:Ignorable="w14 w15 w16se w16cid w16 w16cex w16sdtdh wp14">
+  <w:p>
+    <w:pPr>
+      <w:pStyle w:val="Footer"/>
+    </w:pPr>
+    <w:r>
+      <w:t>V1.01</w:t>
+    </w:r>
+  </w:p>
+</w:ftr>
+</file>
+
+<file path=word/footnotes.xml><?xml version="1.0" encoding="utf-8"?>
+<w:footnotes xmlns:wpc="http://schemas.microsoft.com/office/word/2010/wordprocessingCanvas" xmlns:cx="http://schemas.microsoft.com/office/drawing/2014/chartex" xmlns:cx1="http://schemas.microsoft.com/office/drawing/2015/9/8/chartex" xmlns:cx2="http://schemas.microsoft.com/office/drawing/2015/10/21/chartex" xmlns:cx3="http://schemas.microsoft.com/office/drawing/2016/5/9/chartex" xmlns:cx4="http://schemas.microsoft.com/office/drawing/2016/5/10/chartex" xmlns:cx5="http://schemas.microsoft.com/office/drawing/2016/5/11/chartex" xmlns:cx6="http://schemas.microsoft.com/office/drawing/2016/5/12/chartex" xmlns:cx7="http://schemas.microsoft.com/office/drawing/2016/5/13/chartex" xmlns:cx8="http://schemas.microsoft.com/office/drawing/2016/5/14/chartex" xmlns:mc="http://schemas.openxmlformats.org/markup-compatibility/2006" xmlns:aink="http://schemas.microsoft.com/office/drawing/2016/ink" xmlns:am3d="http://schemas.microsoft.com/office/drawing/2017/model3d" xmlns:o="urn:schemas-microsoft-com:office:office" xmlns:oel="http://schemas.microsoft.com/office/2019/extlst" xmlns:r="http://schemas.openxmlformats.org/officeDocument/2006/relationships" xmlns:m="http://schemas.openxmlformats.org/officeDocument/2006/math" xmlns:v="urn:schemas-microsoft-com:vml" xmlns:wp14="http://schemas.microsoft.com/office/word/2010/wordprocessingDrawing" xmlns:wp="http://schemas.openxmlformats.org/drawingml/2006/wordprocessingDrawing" xmlns:w10="urn:schemas-microsoft-com:office:word" xmlns:w="http://schemas.openxmlformats.org/wordprocessingml/2006/main" xmlns:w14="http://schemas.microsoft.com/office/word/2010/wordml" xmlns:w15="http://schemas.microsoft.com/office/word/2012/wordml" xmlns:w16cex="http://schemas.microsoft.com/office/word/2018/wordml/cex" xmlns:w16cid="http://schemas.microsoft.com/office/word/2016/wordml/cid" xmlns:w16="http://schemas.microsoft.com/office/word/2018/wordml" xmlns:w16sdtdh="http://schemas.microsoft.com/office/word/2020/wordml/sdtdatahash" xmlns:w16se="http://schemas.microsoft.com/office/word/2015/wordml/symex" xmlns:wpg="http://schemas.microsoft.com/office/word/2010/wordprocessingGroup" xmlns:wpi="http://schemas.microsoft.com/office/word/2010/wordprocessingInk" xmlns:wne="http://schemas.microsoft.com/office/word/2006/wordml" xmlns:wps="http://schemas.microsoft.com/office/word/2010/wordprocessingShape" mc:Ignorable="w14 w15 w16se w16cid w16 w16cex w16sdtdh wp14">
+  <w:footnote w:type="separator" w:id="-1">
+    <w:p>
+      <w:pPr>
+        <w:spacing w:after="0" w:line="240" w:lineRule="auto"/>
+      </w:pPr>
+      <w:r>
+        <w:separator/>
+      </w:r>
+    </w:p>
+  </w:footnote>
+  <w:footnote w:type="continuationSeparator" w:id="0">
+    <w:p>
+      <w:pPr>
+        <w:spacing w:after="0" w:line="240" w:lineRule="auto"/>
+      </w:pPr>
+      <w:r>
+        <w:continuationSeparator/>
+      </w:r>
+    </w:p>
+  </w:footnote>
+</w:footnotes>
+</file>
+
+<file path=word/numbering.xml><?xml version="1.0" encoding="utf-8"?>
+<w:numbering xmlns:wpc="http://schemas.microsoft.com/office/word/2010/wordprocessingCanvas" xmlns:cx="http://schemas.microsoft.com/office/drawing/2014/chartex" xmlns:cx1="http://schemas.microsoft.com/office/drawing/2015/9/8/chartex" xmlns:cx2="http://schemas.microsoft.com/office/drawing/2015/10/21/chartex" xmlns:cx3="http://schemas.microsoft.com/office/drawing/2016/5/9/chartex" xmlns:cx4="http://schemas.microsoft.com/office/drawing/2016/5/10/chartex" xmlns:cx5="http://schemas.microsoft.com/office/drawing/2016/5/11/chartex" xmlns:cx6="http://schemas.microsoft.com/office/drawing/2016/5/12/chartex" xmlns:cx7="http://schemas.microsoft.com/office/drawing/2016/5/13/chartex" xmlns:cx8="http://schemas.microsoft.com/office/drawing/2016/5/14/chartex" xmlns:mc="http://schemas.openxmlformats.org/markup-compatibility/2006" xmlns:aink="http://schemas.microsoft.com/office/drawing/2016/ink" xmlns:am3d="http://schemas.microsoft.com/office/drawing/2017/model3d" xmlns:o="urn:schemas-microsoft-com:office:office" xmlns:oel="http://schemas.microsoft.com/office/2019/extlst" xmlns:r="http://schemas.openxmlformats.org/officeDocument/2006/relationships" xmlns:m="http://schemas.openxmlformats.org/officeDocument/2006/math" xmlns:v="urn:schemas-microsoft-com:vml" xmlns:wp14="http://schemas.microsoft.com/office/word/2010/wordprocessingDrawing" xmlns:wp="http://schemas.openxmlformats.org/drawingml/2006/wordprocessingDrawing" xmlns:w10="urn:schemas-microsoft-com:office:word" xmlns:w="http://schemas.openxmlformats.org/wordprocessingml/2006/main" xmlns:w14="http://schemas.microsoft.com/office/word/2010/wordml" xmlns:w15="http://schemas.microsoft.com/office/word/2012/wordml" xmlns:w16cex="http://schemas.microsoft.com/office/word/2018/wordml/cex" xmlns:w16cid="http://schemas.microsoft.com/office/word/2016/wordml/cid" xmlns:w16="http://schemas.microsoft.com/office/word/2018/wordml" xmlns:w16sdtdh="http://schemas.microsoft.com/office/word/2020/wordml/sdtdatahash" xmlns:w16se="http://schemas.microsoft.com/office/word/2015/wordml/symex" xmlns:wpg="http://schemas.microsoft.com/office/word/2010/wordprocessingGroup" xmlns:wpi="http://schemas.microsoft.com/office/word/2010/wordprocessingInk" xmlns:wne="http://schemas.microsoft.com/office/word/2006/wordml" xmlns:wps="http://schemas.microsoft.com/office/word/2010/wordprocessingShape" mc:Ignorable="w14 w15 w16se w16cid w16 w16cex w16sdtdh wp14">
+  <w:abstractNum w:abstractNumId="0" w15:restartNumberingAfterBreak="0">
+    <w:nsid w:val="06906123"/>
+    <w:multiLevelType w:val="multilevel"/>
+    <w:tmpl w:val="A01844EE"/>
+    <w:lvl w:ilvl="0">
+      <w:start w:val="1"/>
+      <w:numFmt w:val="decimal"/>
+      <w:lvlText w:val="%1.0"/>
+      <w:lvlJc w:val="left"/>
+      <w:pPr>
+        <w:ind w:left="720" w:hanging="720"/>
+      </w:pPr>
+      <w:rPr>
+        <w:rFonts w:hint="default"/>
+      </w:rPr>
+    </w:lvl>
+    <w:lvl w:ilvl="1">
+      <w:start w:val="1"/>
+      <w:numFmt w:val="decimal"/>
+      <w:lvlText w:val="%1.%2"/>
+      <w:lvlJc w:val="left"/>
+      <w:pPr>
+        <w:ind w:left="1440" w:hanging="720"/>
+      </w:pPr>
+      <w:rPr>
+        <w:rFonts w:hint="default"/>
+      </w:rPr>
+    </w:lvl>
+    <w:lvl w:ilvl="2">
+      <w:start w:val="1"/>
+      <w:numFmt w:val="decimal"/>
+      <w:lvlText w:val="%1.%2.%3"/>
+      <w:lvlJc w:val="left"/>
+      <w:pPr>
+        <w:ind w:left="2160" w:hanging="720"/>
+      </w:pPr>
+      <w:rPr>
+        <w:rFonts w:hint="default"/>
+      </w:rPr>
+    </w:lvl>
+    <w:lvl w:ilvl="3">
+      <w:start w:val="1"/>
+      <w:numFmt w:val="decimal"/>
+      <w:lvlText w:val="%1.%2.%3.%4"/>
+      <w:lvlJc w:val="left"/>
+      <w:pPr>
+        <w:ind w:left="3240" w:hanging="1080"/>
+      </w:pPr>
+      <w:rPr>
+        <w:rFonts w:hint="default"/>
+      </w:rPr>
+    </w:lvl>
+    <w:lvl w:ilvl="4">
+      <w:start w:val="1"/>
+      <w:numFmt w:val="decimal"/>
+      <w:lvlText w:val="%1.%2.%3.%4.%5"/>
+      <w:lvlJc w:val="left"/>
+      <w:pPr>
+        <w:ind w:left="4320" w:hanging="1440"/>
+      </w:pPr>
+      <w:rPr>
+        <w:rFonts w:hint="default"/>
+      </w:rPr>
+    </w:lvl>
+    <w:lvl w:ilvl="5">
+      <w:start w:val="1"/>
+      <w:numFmt w:val="decimal"/>
+      <w:lvlText w:val="%1.%2.%3.%4.%5.%6"/>
+      <w:lvlJc w:val="left"/>
+      <w:pPr>
+        <w:ind w:left="5040" w:hanging="1440"/>
+      </w:pPr>
+      <w:rPr>
+        <w:rFonts w:hint="default"/>
+      </w:rPr>
+    </w:lvl>
+    <w:lvl w:ilvl="6">
+      <w:start w:val="1"/>
+      <w:numFmt w:val="decimal"/>
+      <w:lvlText w:val="%1.%2.%3.%4.%5.%6.%7"/>
+      <w:lvlJc w:val="left"/>
+      <w:pPr>
+        <w:ind w:left="6120" w:hanging="1800"/>
+      </w:pPr>
+      <w:rPr>
+        <w:rFonts w:hint="default"/>
+      </w:rPr>
+    </w:lvl>
+    <w:lvl w:ilvl="7">
+      <w:start w:val="1"/>
+      <w:numFmt w:val="decimal"/>
+      <w:lvlText w:val="%1.%2.%3.%4.%5.%6.%7.%8"/>
+      <w:lvlJc w:val="left"/>
+      <w:pPr>
+        <w:ind w:left="7200" w:hanging="2160"/>
+      </w:pPr>
+      <w:rPr>
+        <w:rFonts w:hint="default"/>
+      </w:rPr>
+    </w:lvl>
+    <w:lvl w:ilvl="8">
+      <w:start w:val="1"/>
+      <w:numFmt w:val="decimal"/>
+      <w:lvlText w:val="%1.%2.%3.%4.%5.%6.%7.%8.%9"/>
+      <w:lvlJc w:val="left"/>
+      <w:pPr>
+        <w:ind w:left="7920" w:hanging="2160"/>
+      </w:pPr>
+      <w:rPr>
+        <w:rFonts w:hint="default"/>
+      </w:rPr>
+    </w:lvl>
+  </w:abstractNum>
+  <w:abstractNum w:abstractNumId="1" w15:restartNumberingAfterBreak="0">
+    <w:nsid w:val="705826D6"/>
+    <w:multiLevelType w:val="multilevel"/>
+    <w:tmpl w:val="208E467A"/>
+    <w:lvl w:ilvl="0">
+      <w:start w:val="1"/>
+      <w:numFmt w:val="decimal"/>
+      <w:lvlText w:val="%1.0"/>
+      <w:lvlJc w:val="left"/>
+      <w:pPr>
+        <w:ind w:left="360" w:hanging="360"/>
+      </w:pPr>
+      <w:rPr>
+        <w:rFonts w:hint="default"/>
+      </w:rPr>
+    </w:lvl>
+    <w:lvl w:ilvl="1">
+      <w:start w:val="1"/>
+      <w:numFmt w:val="decimal"/>
+      <w:lvlText w:val="%1.%2"/>
+      <w:lvlJc w:val="left"/>
+      <w:pPr>
+        <w:ind w:left="1080" w:hanging="360"/>
+      </w:pPr>
+      <w:rPr>
+        <w:rFonts w:hint="default"/>
+      </w:rPr>
+    </w:lvl>
+    <w:lvl w:ilvl="2">
+      <w:start w:val="1"/>
+      <w:numFmt w:val="decimal"/>
+      <w:lvlText w:val="%1.%2.%3"/>
+      <w:lvlJc w:val="left"/>
+      <w:pPr>
+        <w:ind w:left="2160" w:hanging="720"/>
+      </w:pPr>
+      <w:rPr>
+        <w:rFonts w:hint="default"/>
+      </w:rPr>
+    </w:lvl>
+    <w:lvl w:ilvl="3">
+      <w:start w:val="1"/>
+      <w:numFmt w:val="decimal"/>
+      <w:lvlText w:val="%1.%2.%3.%4"/>
+      <w:lvlJc w:val="left"/>
+      <w:pPr>
+        <w:ind w:left="2880" w:hanging="720"/>
+      </w:pPr>
+      <w:rPr>
+        <w:rFonts w:hint="default"/>
+      </w:rPr>
+    </w:lvl>
+    <w:lvl w:ilvl="4">
+      <w:start w:val="1"/>
+      <w:numFmt w:val="decimal"/>
+      <w:lvlText w:val="%1.%2.%3.%4.%5"/>
+      <w:lvlJc w:val="left"/>
+      <w:pPr>
+        <w:ind w:left="3960" w:hanging="1080"/>
+      </w:pPr>
+      <w:rPr>
+        <w:rFonts w:hint="default"/>
+      </w:rPr>
+    </w:lvl>
+    <w:lvl w:ilvl="5">
+      <w:start w:val="1"/>
+      <w:numFmt w:val="decimal"/>
+      <w:lvlText w:val="%1.%2.%3.%4.%5.%6"/>
+      <w:lvlJc w:val="left"/>
+      <w:pPr>
+        <w:ind w:left="4680" w:hanging="1080"/>
+      </w:pPr>
+      <w:rPr>
+        <w:rFonts w:hint="default"/>
+      </w:rPr>
+    </w:lvl>
+    <w:lvl w:ilvl="6">
+      <w:start w:val="1"/>
+      <w:numFmt w:val="decimal"/>
+      <w:lvlText w:val="%1.%2.%3.%4.%5.%6.%7"/>
+      <w:lvlJc w:val="left"/>
+      <w:pPr>
+        <w:ind w:left="5760" w:hanging="1440"/>
+      </w:pPr>
+      <w:rPr>
+        <w:rFonts w:hint="default"/>
+      </w:rPr>
+    </w:lvl>
+    <w:lvl w:ilvl="7">
+      <w:start w:val="1"/>
+      <w:numFmt w:val="decimal"/>
+      <w:lvlText w:val="%1.%2.%3.%4.%5.%6.%7.%8"/>
+      <w:lvlJc w:val="left"/>
+      <w:pPr>
+        <w:ind w:left="6480" w:hanging="1440"/>
+      </w:pPr>
+      <w:rPr>
+        <w:rFonts w:hint="default"/>
+      </w:rPr>
+    </w:lvl>
+    <w:lvl w:ilvl="8">
+      <w:start w:val="1"/>
+      <w:numFmt w:val="decimal"/>
+      <w:lvlText w:val="%1.%2.%3.%4.%5.%6.%7.%8.%9"/>
+      <w:lvlJc w:val="left"/>
+      <w:pPr>
+        <w:ind w:left="7200" w:hanging="1440"/>
+      </w:pPr>
+      <w:rPr>
+        <w:rFonts w:hint="default"/>
+      </w:rPr>
+    </w:lvl>
+  </w:abstractNum>
+  <w:num w:numId="1" w16cid:durableId="1785071506">
+    <w:abstractNumId w:val="0"/>
+  </w:num>
+  <w:num w:numId="2" w16cid:durableId="621502574">
+    <w:abstractNumId w:val="1"/>
+  </w:num>
+</w:numbering>
 </file>
 
 <file path=word/styles.xml><?xml version="1.0" encoding="utf-8"?>
@@ -3886,6 +4832,61 @@
       <w:szCs w:val="26"/>
     </w:rPr>
   </w:style>
+  <w:style w:type="paragraph" w:styleId="ListParagraph">
+    <w:name w:val="List Paragraph"/>
+    <w:basedOn w:val="Normal"/>
+    <w:uiPriority w:val="34"/>
+    <w:qFormat/>
+    <w:rsid w:val="00DE0292"/>
+    <w:pPr>
+      <w:ind w:left="720"/>
+      <w:contextualSpacing/>
+    </w:pPr>
+  </w:style>
+  <w:style w:type="paragraph" w:styleId="Header">
+    <w:name w:val="header"/>
+    <w:basedOn w:val="Normal"/>
+    <w:link w:val="HeaderChar"/>
+    <w:uiPriority w:val="99"/>
+    <w:unhideWhenUsed/>
+    <w:rsid w:val="00DE0292"/>
+    <w:pPr>
+      <w:tabs>
+        <w:tab w:val="center" w:pos="4513"/>
+        <w:tab w:val="right" w:pos="9026"/>
+      </w:tabs>
+      <w:spacing w:after="0" w:line="240" w:lineRule="auto"/>
+    </w:pPr>
+  </w:style>
+  <w:style w:type="character" w:customStyle="1" w:styleId="HeaderChar">
+    <w:name w:val="Header Char"/>
+    <w:basedOn w:val="DefaultParagraphFont"/>
+    <w:link w:val="Header"/>
+    <w:uiPriority w:val="99"/>
+    <w:rsid w:val="00DE0292"/>
+  </w:style>
+  <w:style w:type="paragraph" w:styleId="Footer">
+    <w:name w:val="footer"/>
+    <w:basedOn w:val="Normal"/>
+    <w:link w:val="FooterChar"/>
+    <w:uiPriority w:val="99"/>
+    <w:unhideWhenUsed/>
+    <w:rsid w:val="00DE0292"/>
+    <w:pPr>
+      <w:tabs>
+        <w:tab w:val="center" w:pos="4513"/>
+        <w:tab w:val="right" w:pos="9026"/>
+      </w:tabs>
+      <w:spacing w:after="0" w:line="240" w:lineRule="auto"/>
+    </w:pPr>
+  </w:style>
+  <w:style w:type="character" w:customStyle="1" w:styleId="FooterChar">
+    <w:name w:val="Footer Char"/>
+    <w:basedOn w:val="DefaultParagraphFont"/>
+    <w:link w:val="Footer"/>
+    <w:uiPriority w:val="99"/>
+    <w:rsid w:val="00DE0292"/>
+  </w:style>
 </w:styles>
 </file>
 

</xml_diff>